<commit_message>
Match the resume and baseball card to the reference designs
Synced from the workshop repo.

Co-Authored-By: Claude Opus 5.5 <noreply@anthropic.com>
Claude-Session: https://claude.ai/code/session_01CB9ZzdGfhLdyLgw6gLftQx
</commit_message>
<xml_diff>
--- a/examples/jordan-rivera/companies/harborline-software/Jordan_Rivera_Resume_Harborline.docx
+++ b/examples/jordan-rivera/companies/harborline-software/Jordan_Rivera_Resume_Harborline.docx
@@ -4,8 +4,7 @@
   <w:body>
     <w:p>
       <w:pPr>
-        <w:spacing w:after="20"/>
-        <w:jc w:val="center"/>
+        <w:spacing w:after="40"/>
       </w:pPr>
       <w:r>
         <w:rPr>
@@ -16,72 +15,177 @@
           <w:sz w:val="40"/>
           <w:szCs w:val="40"/>
         </w:rPr>
-        <w:t xml:space="preserve">Jordan Rivera</w:t>
-      </w:r>
-    </w:p>
-    <w:p>
-      <w:pPr>
-        <w:spacing w:after="40"/>
-        <w:jc w:val="center"/>
-      </w:pPr>
-      <w:r>
-        <w:rPr>
-          <w:rFonts w:ascii="Arial" w:cs="Arial" w:eastAsia="Arial" w:hAnsi="Arial"/>
-          <w:b/>
-          <w:bCs/>
+        <w:t xml:space="preserve">JORDAN RIVERA</w:t>
+      </w:r>
+    </w:p>
+    <w:p>
+      <w:pPr>
+        <w:spacing w:after="20"/>
+      </w:pPr>
+      <w:r>
+        <w:rPr>
+          <w:rFonts w:ascii="Arial" w:cs="Arial" w:eastAsia="Arial" w:hAnsi="Arial"/>
+          <w:b/>
+          <w:bCs/>
+          <w:color w:val="1A1A1A"/>
+          <w:sz w:val="20"/>
+          <w:szCs w:val="20"/>
+        </w:rPr>
+        <w:t xml:space="preserve">VP OPERATIONS </w:t>
+      </w:r>
+      <w:r>
+        <w:rPr>
+          <w:rFonts w:ascii="Arial" w:cs="Arial" w:eastAsia="Arial" w:hAnsi="Arial"/>
+          <w:b/>
+          <w:bCs/>
+          <w:color w:val="1A1A1A"/>
+          <w:sz w:val="20"/>
+          <w:szCs w:val="20"/>
+        </w:rPr>
+        <w:t xml:space="preserve">| SaaS Implementation, Support, and Retention | Logistics Software</w:t>
+      </w:r>
+    </w:p>
+    <w:p>
+      <w:pPr>
+        <w:pBdr>
+          <w:bottom w:val="single" w:color="1A2B4A" w:sz="12" w:space="6"/>
+        </w:pBdr>
+        <w:spacing w:after="100"/>
+      </w:pPr>
+      <w:r>
+        <w:rPr>
+          <w:rFonts w:ascii="Arial" w:cs="Arial" w:eastAsia="Arial" w:hAnsi="Arial"/>
+          <w:color w:val="666666"/>
+          <w:sz w:val="19"/>
+          <w:szCs w:val="19"/>
+        </w:rPr>
+        <w:t xml:space="preserve">Charlotte, NC</w:t>
+      </w:r>
+      <w:r>
+        <w:rPr>
+          <w:rFonts w:ascii="Arial" w:cs="Arial" w:eastAsia="Arial" w:hAnsi="Arial"/>
+          <w:color w:val="666666"/>
+          <w:sz w:val="19"/>
+          <w:szCs w:val="19"/>
+        </w:rPr>
+        <w:t xml:space="preserve">  |  </w:t>
+      </w:r>
+      <w:r>
+        <w:rPr>
+          <w:rFonts w:ascii="Arial" w:cs="Arial" w:eastAsia="Arial" w:hAnsi="Arial"/>
+          <w:color w:val="666666"/>
+          <w:sz w:val="19"/>
+          <w:szCs w:val="19"/>
+        </w:rPr>
+        <w:t xml:space="preserve">(704) 555-0142</w:t>
+      </w:r>
+      <w:r>
+        <w:rPr>
+          <w:rFonts w:ascii="Arial" w:cs="Arial" w:eastAsia="Arial" w:hAnsi="Arial"/>
+          <w:color w:val="666666"/>
+          <w:sz w:val="19"/>
+          <w:szCs w:val="19"/>
+        </w:rPr>
+        <w:t xml:space="preserve">  |  </w:t>
+      </w:r>
+      <w:hyperlink w:history="1" r:id="rId8ehrczmfuw99nalh7hubq">
+        <w:r>
+          <w:rPr>
+            <w:rFonts w:ascii="Arial" w:cs="Arial" w:eastAsia="Arial" w:hAnsi="Arial"/>
+            <w:color w:val="1A2B4A"/>
+            <w:sz w:val="19"/>
+            <w:szCs w:val="19"/>
+            <w:u w:val="single" w:color="1A2B4A"/>
+          </w:rPr>
+          <w:t xml:space="preserve">jordan.rivera@example.com</w:t>
+        </w:r>
+      </w:hyperlink>
+      <w:r>
+        <w:rPr>
+          <w:rFonts w:ascii="Arial" w:cs="Arial" w:eastAsia="Arial" w:hAnsi="Arial"/>
+          <w:color w:val="666666"/>
+          <w:sz w:val="19"/>
+          <w:szCs w:val="19"/>
+        </w:rPr>
+        <w:t xml:space="preserve">  |  </w:t>
+      </w:r>
+      <w:hyperlink w:history="1" r:id="rIdfka6zgcj2jelcjdig0nia">
+        <w:r>
+          <w:rPr>
+            <w:rFonts w:ascii="Arial" w:cs="Arial" w:eastAsia="Arial" w:hAnsi="Arial"/>
+            <w:color w:val="1A2B4A"/>
+            <w:sz w:val="19"/>
+            <w:szCs w:val="19"/>
+            <w:u w:val="single" w:color="1A2B4A"/>
+          </w:rPr>
+          <w:t xml:space="preserve">linkedin.com/in/jordan-rivera-example</w:t>
+        </w:r>
+      </w:hyperlink>
+    </w:p>
+    <w:p>
+      <w:pPr>
+        <w:pBdr>
+          <w:top w:val="single" w:color="F3F5FA" w:sz="4" w:space="2"/>
+          <w:left w:val="single" w:color="1A2B4A" w:sz="24" w:space="8"/>
+          <w:bottom w:val="single" w:color="F3F5FA" w:sz="4" w:space="2"/>
+        </w:pBdr>
+        <w:shd w:fill="F3F5FA" w:color="auto" w:val="clear"/>
+        <w:spacing w:after="0" w:before="60"/>
+        <w:ind w:left="140" w:right="140"/>
+      </w:pPr>
+      <w:r>
+        <w:rPr>
+          <w:rFonts w:ascii="Arial" w:cs="Arial" w:eastAsia="Arial" w:hAnsi="Arial"/>
+          <w:b/>
+          <w:bCs/>
+          <w:color w:val="1A2B4A"/>
           <w:sz w:val="22"/>
           <w:szCs w:val="22"/>
         </w:rPr>
-        <w:t xml:space="preserve">VP Operations | SaaS Implementation, Support, and Retention | Logistics Software</w:t>
-      </w:r>
-    </w:p>
-    <w:p>
-      <w:pPr>
-        <w:spacing w:after="120"/>
-        <w:jc w:val="center"/>
-      </w:pPr>
-      <w:r>
-        <w:rPr>
-          <w:rFonts w:ascii="Arial" w:cs="Arial" w:eastAsia="Arial" w:hAnsi="Arial"/>
+        <w:t xml:space="preserve">16 to 9 wks</w:t>
+      </w:r>
+      <w:r>
+        <w:rPr>
+          <w:rFonts w:ascii="Arial" w:cs="Arial" w:eastAsia="Arial" w:hAnsi="Arial"/>
+          <w:color w:val="666666"/>
           <w:sz w:val="18"/>
           <w:szCs w:val="18"/>
         </w:rPr>
-        <w:t xml:space="preserve">Charlotte, NC  |  (704) 555-0142  |  jordan.rivera@example.com  |  linkedin.com/in/jordan-rivera-example</w:t>
-      </w:r>
-    </w:p>
-    <w:p>
-      <w:pPr>
-        <w:pBdr>
-          <w:top w:val="single" w:color="E6EAF1" w:sz="4" w:space="4"/>
-          <w:bottom w:val="single" w:color="E6EAF1" w:sz="4" w:space="4"/>
-        </w:pBdr>
-        <w:shd w:fill="E6EAF1" w:color="auto" w:val="clear"/>
-        <w:spacing w:after="120" w:before="0"/>
-        <w:jc w:val="center"/>
-      </w:pPr>
-      <w:r>
-        <w:rPr>
-          <w:rFonts w:ascii="Arial" w:cs="Arial" w:eastAsia="Arial" w:hAnsi="Arial"/>
-          <w:b/>
-          <w:bCs/>
-          <w:color w:val="1A2B4A"/>
-          <w:sz w:val="20"/>
-          <w:szCs w:val="20"/>
-        </w:rPr>
-        <w:t xml:space="preserve">16 to 9 wks</w:t>
-      </w:r>
-      <w:r>
-        <w:rPr>
-          <w:rFonts w:ascii="Arial" w:cs="Arial" w:eastAsia="Arial" w:hAnsi="Arial"/>
+        <w:t xml:space="preserve"> go-live time</w:t>
+      </w:r>
+      <w:r>
+        <w:rPr>
+          <w:rFonts w:ascii="Arial" w:cs="Arial" w:eastAsia="Arial" w:hAnsi="Arial"/>
+          <w:color w:val="9AA3B8"/>
+          <w:sz w:val="19"/>
+          <w:szCs w:val="19"/>
+        </w:rPr>
+        <w:t xml:space="preserve">   |   </w:t>
+      </w:r>
+      <w:r>
+        <w:rPr>
+          <w:rFonts w:ascii="Arial" w:cs="Arial" w:eastAsia="Arial" w:hAnsi="Arial"/>
+          <w:b/>
+          <w:bCs/>
+          <w:color w:val="1A2B4A"/>
+          <w:sz w:val="22"/>
+          <w:szCs w:val="22"/>
+        </w:rPr>
+        <w:t xml:space="preserve">95%</w:t>
+      </w:r>
+      <w:r>
+        <w:rPr>
+          <w:rFonts w:ascii="Arial" w:cs="Arial" w:eastAsia="Arial" w:hAnsi="Arial"/>
+          <w:color w:val="666666"/>
           <w:sz w:val="18"/>
           <w:szCs w:val="18"/>
         </w:rPr>
-        <w:t xml:space="preserve"> implementation time</w:t>
-      </w:r>
-      <w:r>
-        <w:rPr>
-          <w:rFonts w:ascii="Arial" w:cs="Arial" w:eastAsia="Arial" w:hAnsi="Arial"/>
-          <w:color w:val="1A2B4A"/>
+        <w:t xml:space="preserve"> revenue retention</w:t>
+      </w:r>
+      <w:r>
+        <w:rPr>
+          <w:rFonts w:ascii="Arial" w:cs="Arial" w:eastAsia="Arial" w:hAnsi="Arial"/>
+          <w:color w:val="9AA3B8"/>
           <w:sz w:val="19"/>
           <w:szCs w:val="19"/>
         </w:rPr>
@@ -93,23 +197,24 @@
           <w:b/>
           <w:bCs/>
           <w:color w:val="1A2B4A"/>
-          <w:sz w:val="20"/>
-          <w:szCs w:val="20"/>
-        </w:rPr>
-        <w:t xml:space="preserve">95%</w:t>
-      </w:r>
-      <w:r>
-        <w:rPr>
-          <w:rFonts w:ascii="Arial" w:cs="Arial" w:eastAsia="Arial" w:hAnsi="Arial"/>
+          <w:sz w:val="22"/>
+          <w:szCs w:val="22"/>
+        </w:rPr>
+        <w:t xml:space="preserve">$11.2M</w:t>
+      </w:r>
+      <w:r>
+        <w:rPr>
+          <w:rFonts w:ascii="Arial" w:cs="Arial" w:eastAsia="Arial" w:hAnsi="Arial"/>
+          <w:color w:val="666666"/>
           <w:sz w:val="18"/>
           <w:szCs w:val="18"/>
         </w:rPr>
-        <w:t xml:space="preserve"> revenue retention</w:t>
-      </w:r>
-      <w:r>
-        <w:rPr>
-          <w:rFonts w:ascii="Arial" w:cs="Arial" w:eastAsia="Arial" w:hAnsi="Arial"/>
-          <w:color w:val="1A2B4A"/>
+        <w:t xml:space="preserve"> budget</w:t>
+      </w:r>
+      <w:r>
+        <w:rPr>
+          <w:rFonts w:ascii="Arial" w:cs="Arial" w:eastAsia="Arial" w:hAnsi="Arial"/>
+          <w:color w:val="9AA3B8"/>
           <w:sz w:val="19"/>
           <w:szCs w:val="19"/>
         </w:rPr>
@@ -121,46 +226,19 @@
           <w:b/>
           <w:bCs/>
           <w:color w:val="1A2B4A"/>
-          <w:sz w:val="20"/>
-          <w:szCs w:val="20"/>
-        </w:rPr>
-        <w:t xml:space="preserve">$11.2M</w:t>
-      </w:r>
-      <w:r>
-        <w:rPr>
-          <w:rFonts w:ascii="Arial" w:cs="Arial" w:eastAsia="Arial" w:hAnsi="Arial"/>
+          <w:sz w:val="22"/>
+          <w:szCs w:val="22"/>
+        </w:rPr>
+        <w:t xml:space="preserve">31 to 12 hrs</w:t>
+      </w:r>
+      <w:r>
+        <w:rPr>
+          <w:rFonts w:ascii="Arial" w:cs="Arial" w:eastAsia="Arial" w:hAnsi="Arial"/>
+          <w:color w:val="666666"/>
           <w:sz w:val="18"/>
           <w:szCs w:val="18"/>
         </w:rPr>
-        <w:t xml:space="preserve"> budget, 64 people</w:t>
-      </w:r>
-      <w:r>
-        <w:rPr>
-          <w:rFonts w:ascii="Arial" w:cs="Arial" w:eastAsia="Arial" w:hAnsi="Arial"/>
-          <w:color w:val="1A2B4A"/>
-          <w:sz w:val="19"/>
-          <w:szCs w:val="19"/>
-        </w:rPr>
-        <w:t xml:space="preserve">   |   </w:t>
-      </w:r>
-      <w:r>
-        <w:rPr>
-          <w:rFonts w:ascii="Arial" w:cs="Arial" w:eastAsia="Arial" w:hAnsi="Arial"/>
-          <w:b/>
-          <w:bCs/>
-          <w:color w:val="1A2B4A"/>
-          <w:sz w:val="20"/>
-          <w:szCs w:val="20"/>
-        </w:rPr>
-        <w:t xml:space="preserve">31 to 12 hrs</w:t>
-      </w:r>
-      <w:r>
-        <w:rPr>
-          <w:rFonts w:ascii="Arial" w:cs="Arial" w:eastAsia="Arial" w:hAnsi="Arial"/>
-          <w:sz w:val="18"/>
-          <w:szCs w:val="18"/>
-        </w:rPr>
-        <w:t xml:space="preserve"> ticket resolution</w:t>
+        <w:t xml:space="preserve"> resolution</w:t>
       </w:r>
     </w:p>
     <w:p>
@@ -168,17 +246,16 @@
         <w:keepNext/>
         <w:keepLines/>
         <w:pBdr>
-          <w:bottom w:val="single" w:color="1A2B4A" w:sz="8" w:space="2"/>
+          <w:bottom w:val="single" w:color="1A2B4A" w:sz="4" w:space="3"/>
         </w:pBdr>
-        <w:spacing w:after="60" w:before="160"/>
-      </w:pPr>
-      <w:r>
-        <w:rPr>
-          <w:rFonts w:ascii="Arial" w:cs="Arial" w:eastAsia="Arial" w:hAnsi="Arial"/>
-          <w:b/>
-          <w:bCs/>
-          <w:color w:val="1A2B4A"/>
-          <w:spacing w:val="20"/>
+        <w:spacing w:after="80" w:before="220"/>
+      </w:pPr>
+      <w:r>
+        <w:rPr>
+          <w:rFonts w:ascii="Arial" w:cs="Arial" w:eastAsia="Arial" w:hAnsi="Arial"/>
+          <w:b/>
+          <w:bCs/>
+          <w:color w:val="1A2B4A"/>
           <w:sz w:val="21"/>
           <w:szCs w:val="21"/>
         </w:rPr>
@@ -188,13 +265,14 @@
     <w:p>
       <w:pPr>
         <w:keepLines/>
-        <w:spacing w:after="80"/>
-      </w:pPr>
-      <w:r>
-        <w:rPr>
-          <w:rFonts w:ascii="Arial" w:cs="Arial" w:eastAsia="Arial" w:hAnsi="Arial"/>
-          <w:sz w:val="21"/>
-          <w:szCs w:val="21"/>
+        <w:spacing w:after="90" w:line="270"/>
+      </w:pPr>
+      <w:r>
+        <w:rPr>
+          <w:rFonts w:ascii="Arial" w:cs="Arial" w:eastAsia="Arial" w:hAnsi="Arial"/>
+          <w:color w:val="1A1A1A"/>
+          <w:sz w:val="20"/>
+          <w:szCs w:val="20"/>
         </w:rPr>
         <w:t xml:space="preserve">Operations leader with 14 years in logistics software, ready to help Harborline reach its goal of "live in 60 days, every customer." I run implementation, support, and training for a 420-person transportation software company, where my team cut average implementation time from 16 weeks to 9 weeks.</w:t>
       </w:r>
@@ -202,13 +280,14 @@
     <w:p>
       <w:pPr>
         <w:keepLines/>
-        <w:spacing w:after="80"/>
-      </w:pPr>
-      <w:r>
-        <w:rPr>
-          <w:rFonts w:ascii="Arial" w:cs="Arial" w:eastAsia="Arial" w:hAnsi="Arial"/>
-          <w:sz w:val="21"/>
-          <w:szCs w:val="21"/>
+        <w:spacing w:after="90" w:line="270"/>
+      </w:pPr>
+      <w:r>
+        <w:rPr>
+          <w:rFonts w:ascii="Arial" w:cs="Arial" w:eastAsia="Arial" w:hAnsi="Arial"/>
+          <w:color w:val="1A1A1A"/>
+          <w:sz w:val="20"/>
+          <w:szCs w:val="20"/>
         </w:rPr>
         <w:t xml:space="preserve">Known for plain metrics, weekly operating rhythms, and teams that keep their best people. Comfortable with acquisitions, fast growth, and boards that want the numbers straight.</w:t>
       </w:r>
@@ -218,17 +297,16 @@
         <w:keepNext/>
         <w:keepLines/>
         <w:pBdr>
-          <w:bottom w:val="single" w:color="1A2B4A" w:sz="8" w:space="2"/>
+          <w:bottom w:val="single" w:color="1A2B4A" w:sz="4" w:space="3"/>
         </w:pBdr>
-        <w:spacing w:after="60" w:before="160"/>
-      </w:pPr>
-      <w:r>
-        <w:rPr>
-          <w:rFonts w:ascii="Arial" w:cs="Arial" w:eastAsia="Arial" w:hAnsi="Arial"/>
-          <w:b/>
-          <w:bCs/>
-          <w:color w:val="1A2B4A"/>
-          <w:spacing w:val="20"/>
+        <w:spacing w:after="80" w:before="220"/>
+      </w:pPr>
+      <w:r>
+        <w:rPr>
+          <w:rFonts w:ascii="Arial" w:cs="Arial" w:eastAsia="Arial" w:hAnsi="Arial"/>
+          <w:b/>
+          <w:bCs/>
+          <w:color w:val="1A2B4A"/>
           <w:sz w:val="21"/>
           <w:szCs w:val="21"/>
         </w:rPr>
@@ -244,13 +322,25 @@
           <w:ilvl w:val="0"/>
           <w:numId w:val="2"/>
         </w:numPr>
-        <w:spacing w:after="40"/>
-      </w:pPr>
-      <w:r>
-        <w:rPr>
-          <w:rFonts w:ascii="Arial" w:cs="Arial" w:eastAsia="Arial" w:hAnsi="Arial"/>
-          <w:sz w:val="21"/>
-          <w:szCs w:val="21"/>
+        <w:spacing w:after="70" w:line="270"/>
+      </w:pPr>
+      <w:r>
+        <w:rPr>
+          <w:rFonts w:ascii="Arial" w:cs="Arial" w:eastAsia="Arial" w:hAnsi="Arial"/>
+          <w:b/>
+          <w:bCs/>
+          <w:color w:val="1A1A1A"/>
+          <w:sz w:val="20"/>
+          <w:szCs w:val="20"/>
+        </w:rPr>
+        <w:t xml:space="preserve">Faster go-lives. </w:t>
+      </w:r>
+      <w:r>
+        <w:rPr>
+          <w:rFonts w:ascii="Arial" w:cs="Arial" w:eastAsia="Arial" w:hAnsi="Arial"/>
+          <w:color w:val="1A1A1A"/>
+          <w:sz w:val="20"/>
+          <w:szCs w:val="20"/>
         </w:rPr>
         <w:t xml:space="preserve">Cut average implementation time from 16 weeks to 9 weeks at Tidewater Freight Systems by rebuilding onboarding around three standard tiers.</w:t>
       </w:r>
@@ -264,13 +354,25 @@
           <w:ilvl w:val="0"/>
           <w:numId w:val="2"/>
         </w:numPr>
-        <w:spacing w:after="40"/>
-      </w:pPr>
-      <w:r>
-        <w:rPr>
-          <w:rFonts w:ascii="Arial" w:cs="Arial" w:eastAsia="Arial" w:hAnsi="Arial"/>
-          <w:sz w:val="21"/>
-          <w:szCs w:val="21"/>
+        <w:spacing w:after="70" w:line="270"/>
+      </w:pPr>
+      <w:r>
+        <w:rPr>
+          <w:rFonts w:ascii="Arial" w:cs="Arial" w:eastAsia="Arial" w:hAnsi="Arial"/>
+          <w:b/>
+          <w:bCs/>
+          <w:color w:val="1A1A1A"/>
+          <w:sz w:val="20"/>
+          <w:szCs w:val="20"/>
+        </w:rPr>
+        <w:t xml:space="preserve">Customers stay. </w:t>
+      </w:r>
+      <w:r>
+        <w:rPr>
+          <w:rFonts w:ascii="Arial" w:cs="Arial" w:eastAsia="Arial" w:hAnsi="Arial"/>
+          <w:color w:val="1A1A1A"/>
+          <w:sz w:val="20"/>
+          <w:szCs w:val="20"/>
         </w:rPr>
         <w:t xml:space="preserve">Helped raise gross revenue retention from 89% to 95% in three years by pairing implementation leads with account owners through the first renewal.</w:t>
       </w:r>
@@ -284,13 +386,25 @@
           <w:ilvl w:val="0"/>
           <w:numId w:val="2"/>
         </w:numPr>
-        <w:spacing w:after="40"/>
-      </w:pPr>
-      <w:r>
-        <w:rPr>
-          <w:rFonts w:ascii="Arial" w:cs="Arial" w:eastAsia="Arial" w:hAnsi="Arial"/>
-          <w:sz w:val="21"/>
-          <w:szCs w:val="21"/>
+        <w:spacing w:after="70" w:line="270"/>
+      </w:pPr>
+      <w:r>
+        <w:rPr>
+          <w:rFonts w:ascii="Arial" w:cs="Arial" w:eastAsia="Arial" w:hAnsi="Arial"/>
+          <w:b/>
+          <w:bCs/>
+          <w:color w:val="1A1A1A"/>
+          <w:sz w:val="20"/>
+          <w:szCs w:val="20"/>
+        </w:rPr>
+        <w:t xml:space="preserve">Acquisition integration. </w:t>
+      </w:r>
+      <w:r>
+        <w:rPr>
+          <w:rFonts w:ascii="Arial" w:cs="Arial" w:eastAsia="Arial" w:hAnsi="Arial"/>
+          <w:color w:val="1A1A1A"/>
+          <w:sz w:val="20"/>
+          <w:szCs w:val="20"/>
         </w:rPr>
         <w:t xml:space="preserve">Integrated an acquired company's 38 employees and 120 customers onto one support platform in 7 months and kept 97% of acquired customers through year one.</w:t>
       </w:r>
@@ -304,13 +418,25 @@
           <w:ilvl w:val="0"/>
           <w:numId w:val="2"/>
         </w:numPr>
-        <w:spacing w:after="40"/>
-      </w:pPr>
-      <w:r>
-        <w:rPr>
-          <w:rFonts w:ascii="Arial" w:cs="Arial" w:eastAsia="Arial" w:hAnsi="Arial"/>
-          <w:sz w:val="21"/>
-          <w:szCs w:val="21"/>
+        <w:spacing w:after="70" w:line="270"/>
+      </w:pPr>
+      <w:r>
+        <w:rPr>
+          <w:rFonts w:ascii="Arial" w:cs="Arial" w:eastAsia="Arial" w:hAnsi="Arial"/>
+          <w:b/>
+          <w:bCs/>
+          <w:color w:val="1A1A1A"/>
+          <w:sz w:val="20"/>
+          <w:szCs w:val="20"/>
+        </w:rPr>
+        <w:t xml:space="preserve">Team built from 6. </w:t>
+      </w:r>
+      <w:r>
+        <w:rPr>
+          <w:rFonts w:ascii="Arial" w:cs="Arial" w:eastAsia="Arial" w:hAnsi="Arial"/>
+          <w:color w:val="1A1A1A"/>
+          <w:sz w:val="20"/>
+          <w:szCs w:val="20"/>
         </w:rPr>
         <w:t xml:space="preserve">Built Kestrel Route Software's implementation team from 6 to 23 people and onboarded 140 new customers in 2017 and 2018.</w:t>
       </w:r>
@@ -324,15 +450,241 @@
           <w:ilvl w:val="0"/>
           <w:numId w:val="2"/>
         </w:numPr>
-        <w:spacing w:after="40"/>
-      </w:pPr>
-      <w:r>
-        <w:rPr>
-          <w:rFonts w:ascii="Arial" w:cs="Arial" w:eastAsia="Arial" w:hAnsi="Arial"/>
+        <w:spacing w:after="70" w:line="270"/>
+      </w:pPr>
+      <w:r>
+        <w:rPr>
+          <w:rFonts w:ascii="Arial" w:cs="Arial" w:eastAsia="Arial" w:hAnsi="Arial"/>
+          <w:b/>
+          <w:bCs/>
+          <w:color w:val="1A1A1A"/>
+          <w:sz w:val="20"/>
+          <w:szCs w:val="20"/>
+        </w:rPr>
+        <w:t xml:space="preserve">On time, every day. </w:t>
+      </w:r>
+      <w:r>
+        <w:rPr>
+          <w:rFonts w:ascii="Arial" w:cs="Arial" w:eastAsia="Arial" w:hAnsi="Arial"/>
+          <w:color w:val="1A1A1A"/>
+          <w:sz w:val="20"/>
+          <w:szCs w:val="20"/>
+        </w:rPr>
+        <w:t xml:space="preserve">Raised on-time shipment rate from 91% to 98.5% across two distribution centers at Brightpine Distribution.</w:t>
+      </w:r>
+    </w:p>
+    <w:p>
+      <w:pPr>
+        <w:keepNext/>
+        <w:keepLines/>
+        <w:pBdr>
+          <w:bottom w:val="single" w:color="1A2B4A" w:sz="4" w:space="3"/>
+        </w:pBdr>
+        <w:spacing w:after="80" w:before="220"/>
+      </w:pPr>
+      <w:r>
+        <w:rPr>
+          <w:rFonts w:ascii="Arial" w:cs="Arial" w:eastAsia="Arial" w:hAnsi="Arial"/>
+          <w:b/>
+          <w:bCs/>
+          <w:color w:val="1A2B4A"/>
           <w:sz w:val="21"/>
           <w:szCs w:val="21"/>
         </w:rPr>
-        <w:t xml:space="preserve">Raised on-time shipment rate from 91% to 98.5% across two distribution centers at Brightpine Distribution.</w:t>
+        <w:t xml:space="preserve">CORE COMPETENCIES</w:t>
+      </w:r>
+    </w:p>
+    <w:p>
+      <w:pPr>
+        <w:keepLines/>
+        <w:spacing w:after="40" w:line="280"/>
+      </w:pPr>
+      <w:r>
+        <w:rPr>
+          <w:rFonts w:ascii="Arial" w:cs="Arial" w:eastAsia="Arial" w:hAnsi="Arial"/>
+          <w:b/>
+          <w:bCs/>
+          <w:color w:val="1A2B4A"/>
+          <w:sz w:val="19"/>
+          <w:szCs w:val="19"/>
+        </w:rPr>
+        <w:t xml:space="preserve">SaaS Operations</w:t>
+      </w:r>
+      <w:r>
+        <w:rPr>
+          <w:rFonts w:ascii="Arial" w:cs="Arial" w:eastAsia="Arial" w:hAnsi="Arial"/>
+          <w:b/>
+          <w:bCs/>
+          <w:color w:val="1A2B4A"/>
+          <w:sz w:val="19"/>
+          <w:szCs w:val="19"/>
+        </w:rPr>
+        <w:t xml:space="preserve">  |  </w:t>
+      </w:r>
+      <w:r>
+        <w:rPr>
+          <w:rFonts w:ascii="Arial" w:cs="Arial" w:eastAsia="Arial" w:hAnsi="Arial"/>
+          <w:b/>
+          <w:bCs/>
+          <w:color w:val="1A2B4A"/>
+          <w:sz w:val="19"/>
+          <w:szCs w:val="19"/>
+        </w:rPr>
+        <w:t xml:space="preserve">Implementation</w:t>
+      </w:r>
+      <w:r>
+        <w:rPr>
+          <w:rFonts w:ascii="Arial" w:cs="Arial" w:eastAsia="Arial" w:hAnsi="Arial"/>
+          <w:b/>
+          <w:bCs/>
+          <w:color w:val="1A2B4A"/>
+          <w:sz w:val="19"/>
+          <w:szCs w:val="19"/>
+        </w:rPr>
+        <w:t xml:space="preserve">  |  </w:t>
+      </w:r>
+      <w:r>
+        <w:rPr>
+          <w:rFonts w:ascii="Arial" w:cs="Arial" w:eastAsia="Arial" w:hAnsi="Arial"/>
+          <w:b/>
+          <w:bCs/>
+          <w:color w:val="1A2B4A"/>
+          <w:sz w:val="19"/>
+          <w:szCs w:val="19"/>
+        </w:rPr>
+        <w:t xml:space="preserve">Customer Support</w:t>
+      </w:r>
+      <w:r>
+        <w:rPr>
+          <w:rFonts w:ascii="Arial" w:cs="Arial" w:eastAsia="Arial" w:hAnsi="Arial"/>
+          <w:b/>
+          <w:bCs/>
+          <w:color w:val="1A2B4A"/>
+          <w:sz w:val="19"/>
+          <w:szCs w:val="19"/>
+        </w:rPr>
+        <w:t xml:space="preserve">  |  </w:t>
+      </w:r>
+      <w:r>
+        <w:rPr>
+          <w:rFonts w:ascii="Arial" w:cs="Arial" w:eastAsia="Arial" w:hAnsi="Arial"/>
+          <w:b/>
+          <w:bCs/>
+          <w:color w:val="1A2B4A"/>
+          <w:sz w:val="19"/>
+          <w:szCs w:val="19"/>
+        </w:rPr>
+        <w:t xml:space="preserve">Revenue Retention</w:t>
+      </w:r>
+      <w:r>
+        <w:rPr>
+          <w:rFonts w:ascii="Arial" w:cs="Arial" w:eastAsia="Arial" w:hAnsi="Arial"/>
+          <w:b/>
+          <w:bCs/>
+          <w:color w:val="1A2B4A"/>
+          <w:sz w:val="19"/>
+          <w:szCs w:val="19"/>
+        </w:rPr>
+        <w:t xml:space="preserve">  |  </w:t>
+      </w:r>
+      <w:r>
+        <w:rPr>
+          <w:rFonts w:ascii="Arial" w:cs="Arial" w:eastAsia="Arial" w:hAnsi="Arial"/>
+          <w:b/>
+          <w:bCs/>
+          <w:color w:val="1A2B4A"/>
+          <w:sz w:val="19"/>
+          <w:szCs w:val="19"/>
+        </w:rPr>
+        <w:t xml:space="preserve">M&amp;A Integration</w:t>
+      </w:r>
+      <w:r>
+        <w:rPr>
+          <w:rFonts w:ascii="Arial" w:cs="Arial" w:eastAsia="Arial" w:hAnsi="Arial"/>
+          <w:b/>
+          <w:bCs/>
+          <w:color w:val="1A2B4A"/>
+          <w:sz w:val="19"/>
+          <w:szCs w:val="19"/>
+        </w:rPr>
+        <w:t xml:space="preserve">  |  </w:t>
+      </w:r>
+      <w:r>
+        <w:rPr>
+          <w:rFonts w:ascii="Arial" w:cs="Arial" w:eastAsia="Arial" w:hAnsi="Arial"/>
+          <w:b/>
+          <w:bCs/>
+          <w:color w:val="1A2B4A"/>
+          <w:sz w:val="19"/>
+          <w:szCs w:val="19"/>
+        </w:rPr>
+        <w:t xml:space="preserve">Process Design</w:t>
+      </w:r>
+      <w:r>
+        <w:rPr>
+          <w:rFonts w:ascii="Arial" w:cs="Arial" w:eastAsia="Arial" w:hAnsi="Arial"/>
+          <w:b/>
+          <w:bCs/>
+          <w:color w:val="1A2B4A"/>
+          <w:sz w:val="19"/>
+          <w:szCs w:val="19"/>
+        </w:rPr>
+        <w:t xml:space="preserve">  |  </w:t>
+      </w:r>
+      <w:r>
+        <w:rPr>
+          <w:rFonts w:ascii="Arial" w:cs="Arial" w:eastAsia="Arial" w:hAnsi="Arial"/>
+          <w:b/>
+          <w:bCs/>
+          <w:color w:val="1A2B4A"/>
+          <w:sz w:val="19"/>
+          <w:szCs w:val="19"/>
+        </w:rPr>
+        <w:t xml:space="preserve">Budget Ownership</w:t>
+      </w:r>
+      <w:r>
+        <w:rPr>
+          <w:rFonts w:ascii="Arial" w:cs="Arial" w:eastAsia="Arial" w:hAnsi="Arial"/>
+          <w:b/>
+          <w:bCs/>
+          <w:color w:val="1A2B4A"/>
+          <w:sz w:val="19"/>
+          <w:szCs w:val="19"/>
+        </w:rPr>
+        <w:t xml:space="preserve">  |  </w:t>
+      </w:r>
+      <w:r>
+        <w:rPr>
+          <w:rFonts w:ascii="Arial" w:cs="Arial" w:eastAsia="Arial" w:hAnsi="Arial"/>
+          <w:b/>
+          <w:bCs/>
+          <w:color w:val="1A2B4A"/>
+          <w:sz w:val="19"/>
+          <w:szCs w:val="19"/>
+        </w:rPr>
+        <w:t xml:space="preserve">KPI Design</w:t>
+      </w:r>
+      <w:r>
+        <w:rPr>
+          <w:rFonts w:ascii="Arial" w:cs="Arial" w:eastAsia="Arial" w:hAnsi="Arial"/>
+          <w:b/>
+          <w:bCs/>
+          <w:color w:val="1A2B4A"/>
+          <w:sz w:val="19"/>
+          <w:szCs w:val="19"/>
+        </w:rPr>
+        <w:t xml:space="preserve">  |  </w:t>
+      </w:r>
+      <w:r>
+        <w:rPr>
+          <w:rFonts w:ascii="Arial" w:cs="Arial" w:eastAsia="Arial" w:hAnsi="Arial"/>
+          <w:b/>
+          <w:bCs/>
+          <w:color w:val="1A2B4A"/>
+          <w:sz w:val="19"/>
+          <w:szCs w:val="19"/>
+        </w:rPr>
+        <w:t xml:space="preserve">Team Building</w:t>
       </w:r>
     </w:p>
     <w:p>
@@ -340,193 +692,134 @@
         <w:keepNext/>
         <w:keepLines/>
         <w:pBdr>
-          <w:bottom w:val="single" w:color="1A2B4A" w:sz="8" w:space="2"/>
+          <w:bottom w:val="single" w:color="1A2B4A" w:sz="4" w:space="3"/>
         </w:pBdr>
-        <w:spacing w:after="60" w:before="160"/>
-      </w:pPr>
-      <w:r>
-        <w:rPr>
-          <w:rFonts w:ascii="Arial" w:cs="Arial" w:eastAsia="Arial" w:hAnsi="Arial"/>
-          <w:b/>
-          <w:bCs/>
-          <w:color w:val="1A2B4A"/>
-          <w:spacing w:val="20"/>
+        <w:spacing w:after="80" w:before="220"/>
+      </w:pPr>
+      <w:r>
+        <w:rPr>
+          <w:rFonts w:ascii="Arial" w:cs="Arial" w:eastAsia="Arial" w:hAnsi="Arial"/>
+          <w:b/>
+          <w:bCs/>
+          <w:color w:val="1A2B4A"/>
           <w:sz w:val="21"/>
           <w:szCs w:val="21"/>
         </w:rPr>
-        <w:t xml:space="preserve">CORE COMPETENCIES</w:t>
-      </w:r>
-    </w:p>
-    <w:p>
-      <w:pPr>
-        <w:keepLines/>
-        <w:spacing w:after="80"/>
-      </w:pPr>
-      <w:r>
-        <w:rPr>
-          <w:rFonts w:ascii="Arial" w:cs="Arial" w:eastAsia="Arial" w:hAnsi="Arial"/>
-          <w:sz w:val="21"/>
-          <w:szCs w:val="21"/>
-        </w:rPr>
-        <w:t xml:space="preserve">SaaS Operations  |  Implementation  |  Customer Support  |  Revenue Retention  |  M&amp;A Integration  |  Process Design  |  Budget Ownership  |  KPI Design  |  Team Building</w:t>
+        <w:t xml:space="preserve">PROFESSIONAL EXPERIENCE</w:t>
       </w:r>
     </w:p>
     <w:p>
       <w:pPr>
         <w:keepNext/>
         <w:keepLines/>
-        <w:pBdr>
-          <w:bottom w:val="single" w:color="1A2B4A" w:sz="8" w:space="2"/>
-        </w:pBdr>
-        <w:spacing w:after="60" w:before="160"/>
-      </w:pPr>
-      <w:r>
-        <w:rPr>
-          <w:rFonts w:ascii="Arial" w:cs="Arial" w:eastAsia="Arial" w:hAnsi="Arial"/>
-          <w:b/>
-          <w:bCs/>
-          <w:color w:val="1A2B4A"/>
-          <w:spacing w:val="20"/>
-          <w:sz w:val="21"/>
-          <w:szCs w:val="21"/>
-        </w:rPr>
-        <w:t xml:space="preserve">EXPERIENCE</w:t>
+        <w:tabs>
+          <w:tab w:val="right" w:pos="10440"/>
+        </w:tabs>
+        <w:spacing w:after="0" w:before="0"/>
+      </w:pPr>
+      <w:r>
+        <w:rPr>
+          <w:rFonts w:ascii="Arial" w:cs="Arial" w:eastAsia="Arial" w:hAnsi="Arial"/>
+          <w:b/>
+          <w:bCs/>
+          <w:color w:val="1A2B4A"/>
+          <w:sz w:val="20"/>
+          <w:szCs w:val="20"/>
+        </w:rPr>
+        <w:t xml:space="preserve">Director of Operations</w:t>
+      </w:r>
+      <w:r>
+        <w:rPr>
+          <w:rFonts w:ascii="Arial" w:cs="Arial" w:eastAsia="Arial" w:hAnsi="Arial"/>
+          <w:color w:val="666666"/>
+          <w:sz w:val="19"/>
+          <w:szCs w:val="19"/>
+        </w:rPr>
+        <w:t xml:space="preserve">	01/2021 to Present</w:t>
       </w:r>
     </w:p>
     <w:p>
       <w:pPr>
         <w:keepNext/>
         <w:keepLines/>
-        <w:tabs>
-          <w:tab w:val="right" w:pos="10800"/>
-        </w:tabs>
-        <w:spacing w:after="0" w:before="100"/>
-      </w:pPr>
-      <w:r>
-        <w:rPr>
-          <w:rFonts w:ascii="Arial" w:cs="Arial" w:eastAsia="Arial" w:hAnsi="Arial"/>
-          <w:b/>
-          <w:bCs/>
-          <w:color w:val="1A2B4A"/>
-          <w:sz w:val="21"/>
-          <w:szCs w:val="21"/>
-        </w:rPr>
-        <w:t xml:space="preserve">Tidewater Freight Systems</w:t>
-      </w:r>
-      <w:r>
-        <w:rPr>
-          <w:rFonts w:ascii="Arial" w:cs="Arial" w:eastAsia="Arial" w:hAnsi="Arial"/>
-          <w:sz w:val="20"/>
-          <w:szCs w:val="20"/>
-        </w:rPr>
-        <w:t xml:space="preserve">, Charlotte, NC</w:t>
-      </w:r>
-      <w:r>
-        <w:rPr>
-          <w:rFonts w:ascii="Arial" w:cs="Arial" w:eastAsia="Arial" w:hAnsi="Arial"/>
-          <w:sz w:val="19"/>
-          <w:szCs w:val="19"/>
-        </w:rPr>
-        <w:t xml:space="preserve">	03/2019 to Present</w:t>
+        <w:spacing w:after="30"/>
+      </w:pPr>
+      <w:r>
+        <w:rPr>
+          <w:rFonts w:ascii="Arial" w:cs="Arial" w:eastAsia="Arial" w:hAnsi="Arial"/>
+          <w:b/>
+          <w:bCs/>
+          <w:color w:val="1A1A1A"/>
+          <w:sz w:val="20"/>
+          <w:szCs w:val="20"/>
+        </w:rPr>
+        <w:t xml:space="preserve">Tidewater Freight Systems, Charlotte, NC</w:t>
       </w:r>
     </w:p>
     <w:p>
       <w:pPr>
         <w:keepNext/>
         <w:keepLines/>
-        <w:tabs>
-          <w:tab w:val="right" w:pos="10800"/>
-        </w:tabs>
-        <w:spacing w:after="0"/>
-      </w:pPr>
-      <w:r>
-        <w:rPr>
-          <w:rFonts w:ascii="Arial" w:cs="Arial" w:eastAsia="Arial" w:hAnsi="Arial"/>
-          <w:b/>
-          <w:bCs/>
+        <w:spacing w:after="40" w:line="250"/>
+      </w:pPr>
+      <w:r>
+        <w:rPr>
+          <w:rFonts w:ascii="Arial" w:cs="Arial" w:eastAsia="Arial" w:hAnsi="Arial"/>
           <w:i/>
           <w:iCs/>
-          <w:sz w:val="21"/>
-          <w:szCs w:val="21"/>
-        </w:rPr>
-        <w:t xml:space="preserve">Director of Operations</w:t>
+          <w:color w:val="666666"/>
+          <w:sz w:val="19"/>
+          <w:szCs w:val="19"/>
+        </w:rPr>
+        <w:t xml:space="preserve">Transportation management software for mid-market shippers and carriers. About 420 employees.</w:t>
+      </w:r>
+    </w:p>
+    <w:p>
+      <w:pPr>
+        <w:keepNext/>
+        <w:keepLines/>
+        <w:spacing w:after="50" w:line="250"/>
+      </w:pPr>
+      <w:r>
+        <w:rPr>
+          <w:rFonts w:ascii="Arial" w:cs="Arial" w:eastAsia="Arial" w:hAnsi="Arial"/>
+          <w:b/>
+          <w:bCs/>
+          <w:color w:val="1A1A1A"/>
+          <w:sz w:val="19"/>
+          <w:szCs w:val="19"/>
+        </w:rPr>
+        <w:t xml:space="preserve">Mandate: </w:t>
       </w:r>
       <w:r>
         <w:rPr>
           <w:rFonts w:ascii="Arial" w:cs="Arial" w:eastAsia="Arial" w:hAnsi="Arial"/>
           <w:i/>
           <w:iCs/>
-          <w:sz w:val="18"/>
-          <w:szCs w:val="18"/>
-        </w:rPr>
-        <w:t xml:space="preserve">	01/2021 to Present</w:t>
-      </w:r>
-    </w:p>
-    <w:p>
-      <w:pPr>
-        <w:keepNext/>
-        <w:keepLines/>
-        <w:tabs>
-          <w:tab w:val="right" w:pos="10800"/>
-        </w:tabs>
-        <w:spacing w:after="0"/>
-      </w:pPr>
-      <w:r>
-        <w:rPr>
-          <w:rFonts w:ascii="Arial" w:cs="Arial" w:eastAsia="Arial" w:hAnsi="Arial"/>
-          <w:b/>
-          <w:bCs/>
-          <w:i/>
-          <w:iCs/>
-          <w:sz w:val="21"/>
-          <w:szCs w:val="21"/>
-        </w:rPr>
-        <w:t xml:space="preserve">Senior Manager, Customer Operations</w:t>
-      </w:r>
-      <w:r>
-        <w:rPr>
-          <w:rFonts w:ascii="Arial" w:cs="Arial" w:eastAsia="Arial" w:hAnsi="Arial"/>
-          <w:i/>
-          <w:iCs/>
-          <w:sz w:val="18"/>
-          <w:szCs w:val="18"/>
-        </w:rPr>
-        <w:t xml:space="preserve">	03/2019 to 12/2020</w:t>
-      </w:r>
-    </w:p>
-    <w:p>
-      <w:pPr>
-        <w:keepNext/>
-        <w:spacing w:after="40"/>
-      </w:pPr>
-      <w:r>
-        <w:rPr>
-          <w:rFonts w:ascii="Arial" w:cs="Arial" w:eastAsia="Arial" w:hAnsi="Arial"/>
-          <w:i/>
-          <w:iCs/>
-          <w:color w:val="444444"/>
-          <w:sz w:val="18"/>
-          <w:szCs w:val="18"/>
-        </w:rPr>
-        <w:t xml:space="preserve">Transportation management software for mid-market shippers and carriers. About 420 employees.</w:t>
+          <w:color w:val="1A1A1A"/>
+          <w:sz w:val="19"/>
+          <w:szCs w:val="19"/>
+        </w:rPr>
+        <w:t xml:space="preserve">Hired to rebuild the post-sale team after a year of slow go-lives and rising churn.</w:t>
       </w:r>
     </w:p>
     <w:p>
       <w:pPr>
         <w:pStyle w:val="ListParagraph"/>
-        <w:keepNext/>
+        <w:keepNext w:val="false"/>
         <w:keepLines/>
         <w:numPr>
           <w:ilvl w:val="0"/>
           <w:numId w:val="2"/>
         </w:numPr>
-        <w:spacing w:after="40"/>
-      </w:pPr>
-      <w:r>
-        <w:rPr>
-          <w:rFonts w:ascii="Arial" w:cs="Arial" w:eastAsia="Arial" w:hAnsi="Arial"/>
-          <w:sz w:val="21"/>
-          <w:szCs w:val="21"/>
+        <w:spacing w:after="70" w:line="270"/>
+      </w:pPr>
+      <w:r>
+        <w:rPr>
+          <w:rFonts w:ascii="Arial" w:cs="Arial" w:eastAsia="Arial" w:hAnsi="Arial"/>
+          <w:color w:val="1A1A1A"/>
+          <w:sz w:val="20"/>
+          <w:szCs w:val="20"/>
         </w:rPr>
         <w:t xml:space="preserve">Lead implementation, support, and training: 64 people and an $11.2M operating budget. Report to the COO.</w:t>
       </w:r>
@@ -540,13 +833,14 @@
           <w:ilvl w:val="0"/>
           <w:numId w:val="2"/>
         </w:numPr>
-        <w:spacing w:after="40"/>
-      </w:pPr>
-      <w:r>
-        <w:rPr>
-          <w:rFonts w:ascii="Arial" w:cs="Arial" w:eastAsia="Arial" w:hAnsi="Arial"/>
-          <w:sz w:val="21"/>
-          <w:szCs w:val="21"/>
+        <w:spacing w:after="70" w:line="270"/>
+      </w:pPr>
+      <w:r>
+        <w:rPr>
+          <w:rFonts w:ascii="Arial" w:cs="Arial" w:eastAsia="Arial" w:hAnsi="Arial"/>
+          <w:color w:val="1A1A1A"/>
+          <w:sz w:val="20"/>
+          <w:szCs w:val="20"/>
         </w:rPr>
         <w:t xml:space="preserve">Rebuilt onboarding around three standard tiers with fixed scopes and go-live checklists; average implementation time fell from 16 weeks to 9 weeks.</w:t>
       </w:r>
@@ -560,13 +854,14 @@
           <w:ilvl w:val="0"/>
           <w:numId w:val="2"/>
         </w:numPr>
-        <w:spacing w:after="40"/>
-      </w:pPr>
-      <w:r>
-        <w:rPr>
-          <w:rFonts w:ascii="Arial" w:cs="Arial" w:eastAsia="Arial" w:hAnsi="Arial"/>
-          <w:sz w:val="21"/>
-          <w:szCs w:val="21"/>
+        <w:spacing w:after="70" w:line="270"/>
+      </w:pPr>
+      <w:r>
+        <w:rPr>
+          <w:rFonts w:ascii="Arial" w:cs="Arial" w:eastAsia="Arial" w:hAnsi="Arial"/>
+          <w:color w:val="1A1A1A"/>
+          <w:sz w:val="20"/>
+          <w:szCs w:val="20"/>
         </w:rPr>
         <w:t xml:space="preserve">Paired each implementation lead with an account owner through the first renewal, which helped raise gross revenue retention from 89% to 95% in three years.</w:t>
       </w:r>
@@ -580,13 +875,14 @@
           <w:ilvl w:val="0"/>
           <w:numId w:val="2"/>
         </w:numPr>
-        <w:spacing w:after="40"/>
-      </w:pPr>
-      <w:r>
-        <w:rPr>
-          <w:rFonts w:ascii="Arial" w:cs="Arial" w:eastAsia="Arial" w:hAnsi="Arial"/>
-          <w:sz w:val="21"/>
-          <w:szCs w:val="21"/>
+        <w:spacing w:after="70" w:line="270"/>
+      </w:pPr>
+      <w:r>
+        <w:rPr>
+          <w:rFonts w:ascii="Arial" w:cs="Arial" w:eastAsia="Arial" w:hAnsi="Arial"/>
+          <w:color w:val="1A1A1A"/>
+          <w:sz w:val="20"/>
+          <w:szCs w:val="20"/>
         </w:rPr>
         <w:t xml:space="preserve">Ran the operations integration of Lanternfish Yard Systems (acquired 2023): 38 employees and 120 customers moved onto one support platform in 7 months, with 97% of acquired customers kept through year one.</w:t>
       </w:r>
@@ -600,13 +896,14 @@
           <w:ilvl w:val="0"/>
           <w:numId w:val="2"/>
         </w:numPr>
-        <w:spacing w:after="40"/>
-      </w:pPr>
-      <w:r>
-        <w:rPr>
-          <w:rFonts w:ascii="Arial" w:cs="Arial" w:eastAsia="Arial" w:hAnsi="Arial"/>
-          <w:sz w:val="21"/>
-          <w:szCs w:val="21"/>
+        <w:spacing w:after="70" w:line="270"/>
+      </w:pPr>
+      <w:r>
+        <w:rPr>
+          <w:rFonts w:ascii="Arial" w:cs="Arial" w:eastAsia="Arial" w:hAnsi="Arial"/>
+          <w:color w:val="1A1A1A"/>
+          <w:sz w:val="20"/>
+          <w:szCs w:val="20"/>
         </w:rPr>
         <w:t xml:space="preserve">Cut average ticket resolution time from 31 hours to 12 hours with tiered routing and a searchable fix library.</w:t>
       </w:r>
@@ -620,13 +917,14 @@
           <w:ilvl w:val="0"/>
           <w:numId w:val="2"/>
         </w:numPr>
-        <w:spacing w:after="40"/>
-      </w:pPr>
-      <w:r>
-        <w:rPr>
-          <w:rFonts w:ascii="Arial" w:cs="Arial" w:eastAsia="Arial" w:hAnsi="Arial"/>
-          <w:sz w:val="21"/>
-          <w:szCs w:val="21"/>
+        <w:spacing w:after="70" w:line="270"/>
+      </w:pPr>
+      <w:r>
+        <w:rPr>
+          <w:rFonts w:ascii="Arial" w:cs="Arial" w:eastAsia="Arial" w:hAnsi="Arial"/>
+          <w:color w:val="1A1A1A"/>
+          <w:sz w:val="20"/>
+          <w:szCs w:val="20"/>
         </w:rPr>
         <w:t xml:space="preserve">Reduced cost to serve per customer 22% from FY2022 to FY2024 while the customer base grew.</w:t>
       </w:r>
@@ -640,13 +938,14 @@
           <w:ilvl w:val="0"/>
           <w:numId w:val="2"/>
         </w:numPr>
-        <w:spacing w:after="40"/>
-      </w:pPr>
-      <w:r>
-        <w:rPr>
-          <w:rFonts w:ascii="Arial" w:cs="Arial" w:eastAsia="Arial" w:hAnsi="Arial"/>
-          <w:sz w:val="21"/>
-          <w:szCs w:val="21"/>
+        <w:spacing w:after="70" w:line="270"/>
+      </w:pPr>
+      <w:r>
+        <w:rPr>
+          <w:rFonts w:ascii="Arial" w:cs="Arial" w:eastAsia="Arial" w:hAnsi="Arial"/>
+          <w:color w:val="1A1A1A"/>
+          <w:sz w:val="20"/>
+          <w:szCs w:val="20"/>
         </w:rPr>
         <w:t xml:space="preserve">Launched a customer training academy that certified 1,100 customer users in 2024.</w:t>
       </w:r>
@@ -660,15 +959,64 @@
           <w:ilvl w:val="0"/>
           <w:numId w:val="2"/>
         </w:numPr>
-        <w:spacing w:after="40"/>
-      </w:pPr>
-      <w:r>
-        <w:rPr>
-          <w:rFonts w:ascii="Arial" w:cs="Arial" w:eastAsia="Arial" w:hAnsi="Arial"/>
-          <w:sz w:val="21"/>
-          <w:szCs w:val="21"/>
+        <w:spacing w:after="70" w:line="270"/>
+      </w:pPr>
+      <w:r>
+        <w:rPr>
+          <w:rFonts w:ascii="Arial" w:cs="Arial" w:eastAsia="Arial" w:hAnsi="Arial"/>
+          <w:color w:val="1A1A1A"/>
+          <w:sz w:val="20"/>
+          <w:szCs w:val="20"/>
         </w:rPr>
         <w:t xml:space="preserve">Consolidated support and training tools from 7 vendors to 3, saving $640K per year.</w:t>
+      </w:r>
+    </w:p>
+    <w:p>
+      <w:pPr>
+        <w:keepNext/>
+        <w:keepLines/>
+        <w:tabs>
+          <w:tab w:val="right" w:pos="10440"/>
+        </w:tabs>
+        <w:spacing w:after="0" w:before="140"/>
+      </w:pPr>
+      <w:r>
+        <w:rPr>
+          <w:rFonts w:ascii="Arial" w:cs="Arial" w:eastAsia="Arial" w:hAnsi="Arial"/>
+          <w:b/>
+          <w:bCs/>
+          <w:color w:val="1A2B4A"/>
+          <w:sz w:val="20"/>
+          <w:szCs w:val="20"/>
+        </w:rPr>
+        <w:t xml:space="preserve">Senior Manager, Customer Operations</w:t>
+      </w:r>
+      <w:r>
+        <w:rPr>
+          <w:rFonts w:ascii="Arial" w:cs="Arial" w:eastAsia="Arial" w:hAnsi="Arial"/>
+          <w:color w:val="666666"/>
+          <w:sz w:val="19"/>
+          <w:szCs w:val="19"/>
+        </w:rPr>
+        <w:t xml:space="preserve">	03/2019 to 12/2020</w:t>
+      </w:r>
+    </w:p>
+    <w:p>
+      <w:pPr>
+        <w:keepNext/>
+        <w:keepLines/>
+        <w:spacing w:after="30"/>
+      </w:pPr>
+      <w:r>
+        <w:rPr>
+          <w:rFonts w:ascii="Arial" w:cs="Arial" w:eastAsia="Arial" w:hAnsi="Arial"/>
+          <w:b/>
+          <w:bCs/>
+          <w:color w:val="1A1A1A"/>
+          <w:sz w:val="20"/>
+          <w:szCs w:val="20"/>
+        </w:rPr>
+        <w:t xml:space="preserve">Tidewater Freight Systems, Charlotte, NC</w:t>
       </w:r>
     </w:p>
     <w:p>
@@ -680,13 +1028,14 @@
           <w:ilvl w:val="0"/>
           <w:numId w:val="2"/>
         </w:numPr>
-        <w:spacing w:after="40"/>
-      </w:pPr>
-      <w:r>
-        <w:rPr>
-          <w:rFonts w:ascii="Arial" w:cs="Arial" w:eastAsia="Arial" w:hAnsi="Arial"/>
-          <w:sz w:val="21"/>
-          <w:szCs w:val="21"/>
+        <w:spacing w:after="70" w:line="270"/>
+      </w:pPr>
+      <w:r>
+        <w:rPr>
+          <w:rFonts w:ascii="Arial" w:cs="Arial" w:eastAsia="Arial" w:hAnsi="Arial"/>
+          <w:color w:val="1A1A1A"/>
+          <w:sz w:val="20"/>
+          <w:szCs w:val="20"/>
         </w:rPr>
         <w:t xml:space="preserve">Built the headcount capacity model finance now uses to plan post-sale hiring each quarter.</w:t>
       </w:r>
@@ -696,32 +1045,25 @@
         <w:keepNext/>
         <w:keepLines/>
         <w:tabs>
-          <w:tab w:val="right" w:pos="10800"/>
+          <w:tab w:val="right" w:pos="10440"/>
         </w:tabs>
-        <w:spacing w:after="0" w:before="100"/>
-      </w:pPr>
-      <w:r>
-        <w:rPr>
-          <w:rFonts w:ascii="Arial" w:cs="Arial" w:eastAsia="Arial" w:hAnsi="Arial"/>
-          <w:b/>
-          <w:bCs/>
-          <w:color w:val="1A2B4A"/>
-          <w:sz w:val="21"/>
-          <w:szCs w:val="21"/>
-        </w:rPr>
-        <w:t xml:space="preserve">Kestrel Route Software</w:t>
-      </w:r>
-      <w:r>
-        <w:rPr>
-          <w:rFonts w:ascii="Arial" w:cs="Arial" w:eastAsia="Arial" w:hAnsi="Arial"/>
-          <w:sz w:val="20"/>
-          <w:szCs w:val="20"/>
-        </w:rPr>
-        <w:t xml:space="preserve">, Atlanta, GA</w:t>
-      </w:r>
-      <w:r>
-        <w:rPr>
-          <w:rFonts w:ascii="Arial" w:cs="Arial" w:eastAsia="Arial" w:hAnsi="Arial"/>
+        <w:spacing w:after="0" w:before="140"/>
+      </w:pPr>
+      <w:r>
+        <w:rPr>
+          <w:rFonts w:ascii="Arial" w:cs="Arial" w:eastAsia="Arial" w:hAnsi="Arial"/>
+          <w:b/>
+          <w:bCs/>
+          <w:color w:val="1A2B4A"/>
+          <w:sz w:val="20"/>
+          <w:szCs w:val="20"/>
+        </w:rPr>
+        <w:t xml:space="preserve">Senior Manager, Implementation</w:t>
+      </w:r>
+      <w:r>
+        <w:rPr>
+          <w:rFonts w:ascii="Arial" w:cs="Arial" w:eastAsia="Arial" w:hAnsi="Arial"/>
+          <w:color w:val="666666"/>
           <w:sz w:val="19"/>
           <w:szCs w:val="19"/>
         </w:rPr>
@@ -732,37 +1074,34 @@
       <w:pPr>
         <w:keepNext/>
         <w:keepLines/>
-        <w:tabs>
-          <w:tab w:val="right" w:pos="10800"/>
-        </w:tabs>
-        <w:spacing w:after="0"/>
-      </w:pPr>
-      <w:r>
-        <w:rPr>
-          <w:rFonts w:ascii="Arial" w:cs="Arial" w:eastAsia="Arial" w:hAnsi="Arial"/>
-          <w:b/>
-          <w:bCs/>
+        <w:spacing w:after="30"/>
+      </w:pPr>
+      <w:r>
+        <w:rPr>
+          <w:rFonts w:ascii="Arial" w:cs="Arial" w:eastAsia="Arial" w:hAnsi="Arial"/>
+          <w:b/>
+          <w:bCs/>
+          <w:color w:val="1A1A1A"/>
+          <w:sz w:val="20"/>
+          <w:szCs w:val="20"/>
+        </w:rPr>
+        <w:t xml:space="preserve">Kestrel Route Software, Atlanta, GA</w:t>
+      </w:r>
+    </w:p>
+    <w:p>
+      <w:pPr>
+        <w:keepNext/>
+        <w:keepLines/>
+        <w:spacing w:after="40" w:line="250"/>
+      </w:pPr>
+      <w:r>
+        <w:rPr>
+          <w:rFonts w:ascii="Arial" w:cs="Arial" w:eastAsia="Arial" w:hAnsi="Arial"/>
           <w:i/>
           <w:iCs/>
-          <w:sz w:val="21"/>
-          <w:szCs w:val="21"/>
-        </w:rPr>
-        <w:t xml:space="preserve">Senior Manager, Implementation</w:t>
-      </w:r>
-    </w:p>
-    <w:p>
-      <w:pPr>
-        <w:keepNext/>
-        <w:spacing w:after="40"/>
-      </w:pPr>
-      <w:r>
-        <w:rPr>
-          <w:rFonts w:ascii="Arial" w:cs="Arial" w:eastAsia="Arial" w:hAnsi="Arial"/>
-          <w:i/>
-          <w:iCs/>
-          <w:color w:val="444444"/>
-          <w:sz w:val="18"/>
-          <w:szCs w:val="18"/>
+          <w:color w:val="666666"/>
+          <w:sz w:val="19"/>
+          <w:szCs w:val="19"/>
         </w:rPr>
         <w:t xml:space="preserve">Route planning software for regional distributors.</w:t>
       </w:r>
@@ -770,19 +1109,20 @@
     <w:p>
       <w:pPr>
         <w:pStyle w:val="ListParagraph"/>
-        <w:keepNext/>
+        <w:keepNext w:val="false"/>
         <w:keepLines/>
         <w:numPr>
           <w:ilvl w:val="0"/>
           <w:numId w:val="2"/>
         </w:numPr>
-        <w:spacing w:after="40"/>
-      </w:pPr>
-      <w:r>
-        <w:rPr>
-          <w:rFonts w:ascii="Arial" w:cs="Arial" w:eastAsia="Arial" w:hAnsi="Arial"/>
-          <w:sz w:val="21"/>
-          <w:szCs w:val="21"/>
+        <w:spacing w:after="70" w:line="270"/>
+      </w:pPr>
+      <w:r>
+        <w:rPr>
+          <w:rFonts w:ascii="Arial" w:cs="Arial" w:eastAsia="Arial" w:hAnsi="Arial"/>
+          <w:color w:val="1A1A1A"/>
+          <w:sz w:val="20"/>
+          <w:szCs w:val="20"/>
         </w:rPr>
         <w:t xml:space="preserve">Built the implementation team from 6 to 23 people and onboarded 140 new customers in 2017 and 2018.</w:t>
       </w:r>
@@ -796,13 +1136,14 @@
           <w:ilvl w:val="0"/>
           <w:numId w:val="2"/>
         </w:numPr>
-        <w:spacing w:after="40"/>
-      </w:pPr>
-      <w:r>
-        <w:rPr>
-          <w:rFonts w:ascii="Arial" w:cs="Arial" w:eastAsia="Arial" w:hAnsi="Arial"/>
-          <w:sz w:val="21"/>
-          <w:szCs w:val="21"/>
+        <w:spacing w:after="70" w:line="270"/>
+      </w:pPr>
+      <w:r>
+        <w:rPr>
+          <w:rFonts w:ascii="Arial" w:cs="Arial" w:eastAsia="Arial" w:hAnsi="Arial"/>
+          <w:color w:val="1A1A1A"/>
+          <w:sz w:val="20"/>
+          <w:szCs w:val="20"/>
         </w:rPr>
         <w:t xml:space="preserve">Wrote the standard implementation playbook that cut go-live defects 45%.</w:t>
       </w:r>
@@ -816,13 +1157,14 @@
           <w:ilvl w:val="0"/>
           <w:numId w:val="2"/>
         </w:numPr>
-        <w:spacing w:after="40"/>
-      </w:pPr>
-      <w:r>
-        <w:rPr>
-          <w:rFonts w:ascii="Arial" w:cs="Arial" w:eastAsia="Arial" w:hAnsi="Arial"/>
-          <w:sz w:val="21"/>
-          <w:szCs w:val="21"/>
+        <w:spacing w:after="70" w:line="270"/>
+      </w:pPr>
+      <w:r>
+        <w:rPr>
+          <w:rFonts w:ascii="Arial" w:cs="Arial" w:eastAsia="Arial" w:hAnsi="Arial"/>
+          <w:color w:val="1A1A1A"/>
+          <w:sz w:val="20"/>
+          <w:szCs w:val="20"/>
         </w:rPr>
         <w:t xml:space="preserve">Set up the first customer health score, used by sales and support to plan renewals.</w:t>
       </w:r>
@@ -836,13 +1178,14 @@
           <w:ilvl w:val="0"/>
           <w:numId w:val="2"/>
         </w:numPr>
-        <w:spacing w:after="40"/>
-      </w:pPr>
-      <w:r>
-        <w:rPr>
-          <w:rFonts w:ascii="Arial" w:cs="Arial" w:eastAsia="Arial" w:hAnsi="Arial"/>
-          <w:sz w:val="21"/>
-          <w:szCs w:val="21"/>
+        <w:spacing w:after="70" w:line="270"/>
+      </w:pPr>
+      <w:r>
+        <w:rPr>
+          <w:rFonts w:ascii="Arial" w:cs="Arial" w:eastAsia="Arial" w:hAnsi="Arial"/>
+          <w:color w:val="1A1A1A"/>
+          <w:sz w:val="20"/>
+          <w:szCs w:val="20"/>
         </w:rPr>
         <w:t xml:space="preserve">Hired and trained the first two implementation managers promoted from within.</w:t>
       </w:r>
@@ -852,115 +1195,63 @@
         <w:keepNext/>
         <w:keepLines/>
         <w:tabs>
-          <w:tab w:val="right" w:pos="10800"/>
+          <w:tab w:val="right" w:pos="10440"/>
         </w:tabs>
-        <w:spacing w:after="0" w:before="100"/>
-      </w:pPr>
-      <w:r>
-        <w:rPr>
-          <w:rFonts w:ascii="Arial" w:cs="Arial" w:eastAsia="Arial" w:hAnsi="Arial"/>
-          <w:b/>
-          <w:bCs/>
-          <w:color w:val="1A2B4A"/>
-          <w:sz w:val="21"/>
-          <w:szCs w:val="21"/>
-        </w:rPr>
-        <w:t xml:space="preserve">Brightpine Distribution</w:t>
-      </w:r>
-      <w:r>
-        <w:rPr>
-          <w:rFonts w:ascii="Arial" w:cs="Arial" w:eastAsia="Arial" w:hAnsi="Arial"/>
-          <w:sz w:val="20"/>
-          <w:szCs w:val="20"/>
-        </w:rPr>
-        <w:t xml:space="preserve">, Charlotte, NC</w:t>
-      </w:r>
-      <w:r>
-        <w:rPr>
-          <w:rFonts w:ascii="Arial" w:cs="Arial" w:eastAsia="Arial" w:hAnsi="Arial"/>
-          <w:sz w:val="19"/>
-          <w:szCs w:val="19"/>
-        </w:rPr>
-        <w:t xml:space="preserve">	07/2012 to 05/2015</w:t>
+        <w:spacing w:after="0" w:before="140"/>
+      </w:pPr>
+      <w:r>
+        <w:rPr>
+          <w:rFonts w:ascii="Arial" w:cs="Arial" w:eastAsia="Arial" w:hAnsi="Arial"/>
+          <w:b/>
+          <w:bCs/>
+          <w:color w:val="1A2B4A"/>
+          <w:sz w:val="20"/>
+          <w:szCs w:val="20"/>
+        </w:rPr>
+        <w:t xml:space="preserve">Operations Manager</w:t>
+      </w:r>
+      <w:r>
+        <w:rPr>
+          <w:rFonts w:ascii="Arial" w:cs="Arial" w:eastAsia="Arial" w:hAnsi="Arial"/>
+          <w:color w:val="666666"/>
+          <w:sz w:val="19"/>
+          <w:szCs w:val="19"/>
+        </w:rPr>
+        <w:t xml:space="preserve">	09/2013 to 05/2015</w:t>
       </w:r>
     </w:p>
     <w:p>
       <w:pPr>
         <w:keepNext/>
         <w:keepLines/>
-        <w:tabs>
-          <w:tab w:val="right" w:pos="10800"/>
-        </w:tabs>
-        <w:spacing w:after="0"/>
-      </w:pPr>
-      <w:r>
-        <w:rPr>
-          <w:rFonts w:ascii="Arial" w:cs="Arial" w:eastAsia="Arial" w:hAnsi="Arial"/>
-          <w:b/>
-          <w:bCs/>
+        <w:spacing w:after="30"/>
+      </w:pPr>
+      <w:r>
+        <w:rPr>
+          <w:rFonts w:ascii="Arial" w:cs="Arial" w:eastAsia="Arial" w:hAnsi="Arial"/>
+          <w:b/>
+          <w:bCs/>
+          <w:color w:val="1A1A1A"/>
+          <w:sz w:val="20"/>
+          <w:szCs w:val="20"/>
+        </w:rPr>
+        <w:t xml:space="preserve">Brightpine Distribution, Charlotte, NC</w:t>
+      </w:r>
+    </w:p>
+    <w:p>
+      <w:pPr>
+        <w:keepNext/>
+        <w:keepLines/>
+        <w:spacing w:after="40" w:line="250"/>
+      </w:pPr>
+      <w:r>
+        <w:rPr>
+          <w:rFonts w:ascii="Arial" w:cs="Arial" w:eastAsia="Arial" w:hAnsi="Arial"/>
           <w:i/>
           <w:iCs/>
-          <w:sz w:val="21"/>
-          <w:szCs w:val="21"/>
-        </w:rPr>
-        <w:t xml:space="preserve">Operations Manager</w:t>
-      </w:r>
-      <w:r>
-        <w:rPr>
-          <w:rFonts w:ascii="Arial" w:cs="Arial" w:eastAsia="Arial" w:hAnsi="Arial"/>
-          <w:i/>
-          <w:iCs/>
-          <w:sz w:val="18"/>
-          <w:szCs w:val="18"/>
-        </w:rPr>
-        <w:t xml:space="preserve">	09/2013 to 05/2015</w:t>
-      </w:r>
-    </w:p>
-    <w:p>
-      <w:pPr>
-        <w:keepNext/>
-        <w:keepLines/>
-        <w:tabs>
-          <w:tab w:val="right" w:pos="10800"/>
-        </w:tabs>
-        <w:spacing w:after="0"/>
-      </w:pPr>
-      <w:r>
-        <w:rPr>
-          <w:rFonts w:ascii="Arial" w:cs="Arial" w:eastAsia="Arial" w:hAnsi="Arial"/>
-          <w:b/>
-          <w:bCs/>
-          <w:i/>
-          <w:iCs/>
-          <w:sz w:val="21"/>
-          <w:szCs w:val="21"/>
-        </w:rPr>
-        <w:t xml:space="preserve">Logistics Analyst</w:t>
-      </w:r>
-      <w:r>
-        <w:rPr>
-          <w:rFonts w:ascii="Arial" w:cs="Arial" w:eastAsia="Arial" w:hAnsi="Arial"/>
-          <w:i/>
-          <w:iCs/>
-          <w:sz w:val="18"/>
-          <w:szCs w:val="18"/>
-        </w:rPr>
-        <w:t xml:space="preserve">	07/2012 to 08/2013</w:t>
-      </w:r>
-    </w:p>
-    <w:p>
-      <w:pPr>
-        <w:keepNext/>
-        <w:spacing w:after="40"/>
-      </w:pPr>
-      <w:r>
-        <w:rPr>
-          <w:rFonts w:ascii="Arial" w:cs="Arial" w:eastAsia="Arial" w:hAnsi="Arial"/>
-          <w:i/>
-          <w:iCs/>
-          <w:color w:val="444444"/>
-          <w:sz w:val="18"/>
-          <w:szCs w:val="18"/>
+          <w:color w:val="666666"/>
+          <w:sz w:val="19"/>
+          <w:szCs w:val="19"/>
         </w:rPr>
         <w:t xml:space="preserve">Third-party logistics provider with two distribution centers.</w:t>
       </w:r>
@@ -968,19 +1259,20 @@
     <w:p>
       <w:pPr>
         <w:pStyle w:val="ListParagraph"/>
-        <w:keepNext/>
+        <w:keepNext w:val="false"/>
         <w:keepLines/>
         <w:numPr>
           <w:ilvl w:val="0"/>
           <w:numId w:val="2"/>
         </w:numPr>
-        <w:spacing w:after="40"/>
-      </w:pPr>
-      <w:r>
-        <w:rPr>
-          <w:rFonts w:ascii="Arial" w:cs="Arial" w:eastAsia="Arial" w:hAnsi="Arial"/>
-          <w:sz w:val="21"/>
-          <w:szCs w:val="21"/>
+        <w:spacing w:after="70" w:line="270"/>
+      </w:pPr>
+      <w:r>
+        <w:rPr>
+          <w:rFonts w:ascii="Arial" w:cs="Arial" w:eastAsia="Arial" w:hAnsi="Arial"/>
+          <w:color w:val="1A1A1A"/>
+          <w:sz w:val="20"/>
+          <w:szCs w:val="20"/>
         </w:rPr>
         <w:t xml:space="preserve">Ran daily operations for two distribution centers and 85 hourly associates.</w:t>
       </w:r>
@@ -994,13 +1286,14 @@
           <w:ilvl w:val="0"/>
           <w:numId w:val="2"/>
         </w:numPr>
-        <w:spacing w:after="40"/>
-      </w:pPr>
-      <w:r>
-        <w:rPr>
-          <w:rFonts w:ascii="Arial" w:cs="Arial" w:eastAsia="Arial" w:hAnsi="Arial"/>
-          <w:sz w:val="21"/>
-          <w:szCs w:val="21"/>
+        <w:spacing w:after="70" w:line="270"/>
+      </w:pPr>
+      <w:r>
+        <w:rPr>
+          <w:rFonts w:ascii="Arial" w:cs="Arial" w:eastAsia="Arial" w:hAnsi="Arial"/>
+          <w:color w:val="1A1A1A"/>
+          <w:sz w:val="20"/>
+          <w:szCs w:val="20"/>
         </w:rPr>
         <w:t xml:space="preserve">Raised on-time shipment rate from 91% to 98.5% across both distribution centers.</w:t>
       </w:r>
@@ -1014,15 +1307,64 @@
           <w:ilvl w:val="0"/>
           <w:numId w:val="2"/>
         </w:numPr>
-        <w:spacing w:after="40"/>
-      </w:pPr>
-      <w:r>
-        <w:rPr>
-          <w:rFonts w:ascii="Arial" w:cs="Arial" w:eastAsia="Arial" w:hAnsi="Arial"/>
-          <w:sz w:val="21"/>
-          <w:szCs w:val="21"/>
+        <w:spacing w:after="70" w:line="270"/>
+      </w:pPr>
+      <w:r>
+        <w:rPr>
+          <w:rFonts w:ascii="Arial" w:cs="Arial" w:eastAsia="Arial" w:hAnsi="Arial"/>
+          <w:color w:val="1A1A1A"/>
+          <w:sz w:val="20"/>
+          <w:szCs w:val="20"/>
         </w:rPr>
         <w:t xml:space="preserve">Cut overtime cost by $410K per year with demand-based shift planning.</w:t>
+      </w:r>
+    </w:p>
+    <w:p>
+      <w:pPr>
+        <w:keepNext/>
+        <w:keepLines/>
+        <w:tabs>
+          <w:tab w:val="right" w:pos="10440"/>
+        </w:tabs>
+        <w:spacing w:after="0" w:before="140"/>
+      </w:pPr>
+      <w:r>
+        <w:rPr>
+          <w:rFonts w:ascii="Arial" w:cs="Arial" w:eastAsia="Arial" w:hAnsi="Arial"/>
+          <w:b/>
+          <w:bCs/>
+          <w:color w:val="1A2B4A"/>
+          <w:sz w:val="20"/>
+          <w:szCs w:val="20"/>
+        </w:rPr>
+        <w:t xml:space="preserve">Logistics Analyst</w:t>
+      </w:r>
+      <w:r>
+        <w:rPr>
+          <w:rFonts w:ascii="Arial" w:cs="Arial" w:eastAsia="Arial" w:hAnsi="Arial"/>
+          <w:color w:val="666666"/>
+          <w:sz w:val="19"/>
+          <w:szCs w:val="19"/>
+        </w:rPr>
+        <w:t xml:space="preserve">	07/2012 to 08/2013</w:t>
+      </w:r>
+    </w:p>
+    <w:p>
+      <w:pPr>
+        <w:keepNext/>
+        <w:keepLines/>
+        <w:spacing w:after="30"/>
+      </w:pPr>
+      <w:r>
+        <w:rPr>
+          <w:rFonts w:ascii="Arial" w:cs="Arial" w:eastAsia="Arial" w:hAnsi="Arial"/>
+          <w:b/>
+          <w:bCs/>
+          <w:color w:val="1A1A1A"/>
+          <w:sz w:val="20"/>
+          <w:szCs w:val="20"/>
+        </w:rPr>
+        <w:t xml:space="preserve">Brightpine Distribution, Charlotte, NC</w:t>
       </w:r>
     </w:p>
     <w:p>
@@ -1034,49 +1376,50 @@
           <w:ilvl w:val="0"/>
           <w:numId w:val="2"/>
         </w:numPr>
-        <w:spacing w:after="40"/>
-      </w:pPr>
-      <w:r>
-        <w:rPr>
-          <w:rFonts w:ascii="Arial" w:cs="Arial" w:eastAsia="Arial" w:hAnsi="Arial"/>
+        <w:spacing w:after="70" w:line="270"/>
+      </w:pPr>
+      <w:r>
+        <w:rPr>
+          <w:rFonts w:ascii="Arial" w:cs="Arial" w:eastAsia="Arial" w:hAnsi="Arial"/>
+          <w:color w:val="1A1A1A"/>
+          <w:sz w:val="20"/>
+          <w:szCs w:val="20"/>
+        </w:rPr>
+        <w:t xml:space="preserve">Built the weekly carrier scorecard used in rate negotiations.</w:t>
+      </w:r>
+    </w:p>
+    <w:p>
+      <w:pPr>
+        <w:keepNext/>
+        <w:keepLines/>
+        <w:pBdr>
+          <w:bottom w:val="single" w:color="1A2B4A" w:sz="4" w:space="3"/>
+        </w:pBdr>
+        <w:spacing w:after="80" w:before="220"/>
+      </w:pPr>
+      <w:r>
+        <w:rPr>
+          <w:rFonts w:ascii="Arial" w:cs="Arial" w:eastAsia="Arial" w:hAnsi="Arial"/>
+          <w:b/>
+          <w:bCs/>
+          <w:color w:val="1A2B4A"/>
           <w:sz w:val="21"/>
           <w:szCs w:val="21"/>
         </w:rPr>
-        <w:t xml:space="preserve">As a logistics analyst, built the weekly carrier scorecard used in rate negotiations.</w:t>
-      </w:r>
-    </w:p>
-    <w:p>
-      <w:pPr>
-        <w:keepNext/>
-        <w:keepLines/>
-        <w:pBdr>
-          <w:bottom w:val="single" w:color="1A2B4A" w:sz="8" w:space="2"/>
-        </w:pBdr>
-        <w:spacing w:after="60" w:before="160"/>
-      </w:pPr>
-      <w:r>
-        <w:rPr>
-          <w:rFonts w:ascii="Arial" w:cs="Arial" w:eastAsia="Arial" w:hAnsi="Arial"/>
-          <w:b/>
-          <w:bCs/>
-          <w:color w:val="1A2B4A"/>
-          <w:spacing w:val="20"/>
-          <w:sz w:val="21"/>
-          <w:szCs w:val="21"/>
-        </w:rPr>
         <w:t xml:space="preserve">EDUCATION AND CERTIFICATIONS</w:t>
       </w:r>
     </w:p>
     <w:p>
       <w:pPr>
         <w:keepLines/>
-        <w:spacing w:after="20"/>
-      </w:pPr>
-      <w:r>
-        <w:rPr>
-          <w:rFonts w:ascii="Arial" w:cs="Arial" w:eastAsia="Arial" w:hAnsi="Arial"/>
-          <w:sz w:val="21"/>
-          <w:szCs w:val="21"/>
+        <w:spacing w:after="0" w:line="280"/>
+      </w:pPr>
+      <w:r>
+        <w:rPr>
+          <w:rFonts w:ascii="Arial" w:cs="Arial" w:eastAsia="Arial" w:hAnsi="Arial"/>
+          <w:color w:val="1A1A1A"/>
+          <w:sz w:val="20"/>
+          <w:szCs w:val="20"/>
         </w:rPr>
         <w:t xml:space="preserve">B.S. Industrial Engineering, Carolina Lakes University (fictional), 2012</w:t>
       </w:r>
@@ -1084,13 +1427,14 @@
     <w:p>
       <w:pPr>
         <w:keepLines/>
-        <w:spacing w:after="20"/>
-      </w:pPr>
-      <w:r>
-        <w:rPr>
-          <w:rFonts w:ascii="Arial" w:cs="Arial" w:eastAsia="Arial" w:hAnsi="Arial"/>
-          <w:sz w:val="21"/>
-          <w:szCs w:val="21"/>
+        <w:spacing w:after="0" w:line="280"/>
+      </w:pPr>
+      <w:r>
+        <w:rPr>
+          <w:rFonts w:ascii="Arial" w:cs="Arial" w:eastAsia="Arial" w:hAnsi="Arial"/>
+          <w:color w:val="1A1A1A"/>
+          <w:sz w:val="20"/>
+          <w:szCs w:val="20"/>
         </w:rPr>
         <w:t xml:space="preserve">Certified Supply Chain Professional (CSCP), 2016</w:t>
       </w:r>
@@ -1098,20 +1442,21 @@
     <w:p>
       <w:pPr>
         <w:keepLines/>
-        <w:spacing w:after="20"/>
-      </w:pPr>
-      <w:r>
-        <w:rPr>
-          <w:rFonts w:ascii="Arial" w:cs="Arial" w:eastAsia="Arial" w:hAnsi="Arial"/>
-          <w:sz w:val="21"/>
-          <w:szCs w:val="21"/>
+        <w:spacing w:after="0" w:line="280"/>
+      </w:pPr>
+      <w:r>
+        <w:rPr>
+          <w:rFonts w:ascii="Arial" w:cs="Arial" w:eastAsia="Arial" w:hAnsi="Arial"/>
+          <w:color w:val="1A1A1A"/>
+          <w:sz w:val="20"/>
+          <w:szCs w:val="20"/>
         </w:rPr>
         <w:t xml:space="preserve">Lean Six Sigma Green Belt, 2014</w:t>
       </w:r>
     </w:p>
     <w:sectPr>
       <w:pgSz w:w="12240" w:h="15840" w:orient="portrait"/>
-      <w:pgMar w:top="720" w:right="720" w:bottom="720" w:left="720" w:header="708" w:footer="708" w:gutter="0"/>
+      <w:pgMar w:top="720" w:right="900" w:bottom="720" w:left="900" w:header="708" w:footer="708" w:gutter="0"/>
       <w:pgNumType/>
       <w:docGrid w:linePitch="360"/>
     </w:sectPr>
@@ -1289,6 +1634,10 @@
       <w:pPr>
         <w:ind w:left="300" w:hanging="220"/>
       </w:pPr>
+      <w:rPr>
+        <w:rFonts w:ascii="Arial" w:cs="Arial" w:eastAsia="Arial" w:hAnsi="Arial"/>
+        <w:color w:val="000000"/>
+      </w:rPr>
     </w:lvl>
   </w:abstractNum>
   <w:num w:numId="1">
@@ -1312,8 +1661,9 @@
     <w:rPrDefault>
       <w:rPr>
         <w:rFonts w:ascii="Arial" w:cs="Arial" w:eastAsia="Arial" w:hAnsi="Arial"/>
-        <w:sz w:val="21"/>
-        <w:szCs w:val="21"/>
+        <w:color w:val="1A1A1A"/>
+        <w:sz w:val="20"/>
+        <w:szCs w:val="20"/>
       </w:rPr>
     </w:rPrDefault>
     <w:pPrDefault/>

</xml_diff>

<commit_message>
Sync from workshop 2c12e09
</commit_message>
<xml_diff>
--- a/examples/jordan-rivera/companies/harborline-software/Jordan_Rivera_Resume_Harborline.docx
+++ b/examples/jordan-rivera/companies/harborline-software/Jordan_Rivera_Resume_Harborline.docx
@@ -4,8 +4,7 @@
   <w:body>
     <w:p>
       <w:pPr>
-        <w:spacing w:after="20"/>
-        <w:jc w:val="center"/>
+        <w:spacing w:after="40"/>
       </w:pPr>
       <w:r>
         <w:rPr>
@@ -16,72 +15,177 @@
           <w:sz w:val="40"/>
           <w:szCs w:val="40"/>
         </w:rPr>
-        <w:t xml:space="preserve">Jordan Rivera</w:t>
-      </w:r>
-    </w:p>
-    <w:p>
-      <w:pPr>
-        <w:spacing w:after="40"/>
-        <w:jc w:val="center"/>
-      </w:pPr>
-      <w:r>
-        <w:rPr>
-          <w:rFonts w:ascii="Arial" w:cs="Arial" w:eastAsia="Arial" w:hAnsi="Arial"/>
-          <w:b/>
-          <w:bCs/>
+        <w:t xml:space="preserve">JORDAN RIVERA</w:t>
+      </w:r>
+    </w:p>
+    <w:p>
+      <w:pPr>
+        <w:spacing w:after="20"/>
+      </w:pPr>
+      <w:r>
+        <w:rPr>
+          <w:rFonts w:ascii="Arial" w:cs="Arial" w:eastAsia="Arial" w:hAnsi="Arial"/>
+          <w:b/>
+          <w:bCs/>
+          <w:color w:val="1A1A1A"/>
+          <w:sz w:val="20"/>
+          <w:szCs w:val="20"/>
+        </w:rPr>
+        <w:t xml:space="preserve">VP OPERATIONS </w:t>
+      </w:r>
+      <w:r>
+        <w:rPr>
+          <w:rFonts w:ascii="Arial" w:cs="Arial" w:eastAsia="Arial" w:hAnsi="Arial"/>
+          <w:b/>
+          <w:bCs/>
+          <w:color w:val="1A1A1A"/>
+          <w:sz w:val="20"/>
+          <w:szCs w:val="20"/>
+        </w:rPr>
+        <w:t xml:space="preserve">| SaaS Implementation, Support, and Retention | Logistics Software</w:t>
+      </w:r>
+    </w:p>
+    <w:p>
+      <w:pPr>
+        <w:pBdr>
+          <w:bottom w:val="single" w:color="1A2B4A" w:sz="12" w:space="6"/>
+        </w:pBdr>
+        <w:spacing w:after="100"/>
+      </w:pPr>
+      <w:r>
+        <w:rPr>
+          <w:rFonts w:ascii="Arial" w:cs="Arial" w:eastAsia="Arial" w:hAnsi="Arial"/>
+          <w:color w:val="666666"/>
+          <w:sz w:val="19"/>
+          <w:szCs w:val="19"/>
+        </w:rPr>
+        <w:t xml:space="preserve">Charlotte, NC</w:t>
+      </w:r>
+      <w:r>
+        <w:rPr>
+          <w:rFonts w:ascii="Arial" w:cs="Arial" w:eastAsia="Arial" w:hAnsi="Arial"/>
+          <w:color w:val="666666"/>
+          <w:sz w:val="19"/>
+          <w:szCs w:val="19"/>
+        </w:rPr>
+        <w:t xml:space="preserve">  |  </w:t>
+      </w:r>
+      <w:r>
+        <w:rPr>
+          <w:rFonts w:ascii="Arial" w:cs="Arial" w:eastAsia="Arial" w:hAnsi="Arial"/>
+          <w:color w:val="666666"/>
+          <w:sz w:val="19"/>
+          <w:szCs w:val="19"/>
+        </w:rPr>
+        <w:t xml:space="preserve">(704) 555-0142</w:t>
+      </w:r>
+      <w:r>
+        <w:rPr>
+          <w:rFonts w:ascii="Arial" w:cs="Arial" w:eastAsia="Arial" w:hAnsi="Arial"/>
+          <w:color w:val="666666"/>
+          <w:sz w:val="19"/>
+          <w:szCs w:val="19"/>
+        </w:rPr>
+        <w:t xml:space="preserve">  |  </w:t>
+      </w:r>
+      <w:hyperlink w:history="1" r:id="rId8ehrczmfuw99nalh7hubq">
+        <w:r>
+          <w:rPr>
+            <w:rFonts w:ascii="Arial" w:cs="Arial" w:eastAsia="Arial" w:hAnsi="Arial"/>
+            <w:color w:val="1A2B4A"/>
+            <w:sz w:val="19"/>
+            <w:szCs w:val="19"/>
+            <w:u w:val="single" w:color="1A2B4A"/>
+          </w:rPr>
+          <w:t xml:space="preserve">jordan.rivera@example.com</w:t>
+        </w:r>
+      </w:hyperlink>
+      <w:r>
+        <w:rPr>
+          <w:rFonts w:ascii="Arial" w:cs="Arial" w:eastAsia="Arial" w:hAnsi="Arial"/>
+          <w:color w:val="666666"/>
+          <w:sz w:val="19"/>
+          <w:szCs w:val="19"/>
+        </w:rPr>
+        <w:t xml:space="preserve">  |  </w:t>
+      </w:r>
+      <w:hyperlink w:history="1" r:id="rIdfka6zgcj2jelcjdig0nia">
+        <w:r>
+          <w:rPr>
+            <w:rFonts w:ascii="Arial" w:cs="Arial" w:eastAsia="Arial" w:hAnsi="Arial"/>
+            <w:color w:val="1A2B4A"/>
+            <w:sz w:val="19"/>
+            <w:szCs w:val="19"/>
+            <w:u w:val="single" w:color="1A2B4A"/>
+          </w:rPr>
+          <w:t xml:space="preserve">linkedin.com/in/jordan-rivera-example</w:t>
+        </w:r>
+      </w:hyperlink>
+    </w:p>
+    <w:p>
+      <w:pPr>
+        <w:pBdr>
+          <w:top w:val="single" w:color="F3F5FA" w:sz="4" w:space="2"/>
+          <w:left w:val="single" w:color="1A2B4A" w:sz="24" w:space="8"/>
+          <w:bottom w:val="single" w:color="F3F5FA" w:sz="4" w:space="2"/>
+        </w:pBdr>
+        <w:shd w:fill="F3F5FA" w:color="auto" w:val="clear"/>
+        <w:spacing w:after="0" w:before="60"/>
+        <w:ind w:left="140" w:right="140"/>
+      </w:pPr>
+      <w:r>
+        <w:rPr>
+          <w:rFonts w:ascii="Arial" w:cs="Arial" w:eastAsia="Arial" w:hAnsi="Arial"/>
+          <w:b/>
+          <w:bCs/>
+          <w:color w:val="1A2B4A"/>
           <w:sz w:val="22"/>
           <w:szCs w:val="22"/>
         </w:rPr>
-        <w:t xml:space="preserve">VP Operations | SaaS Implementation, Support, and Retention | Logistics Software</w:t>
-      </w:r>
-    </w:p>
-    <w:p>
-      <w:pPr>
-        <w:spacing w:after="120"/>
-        <w:jc w:val="center"/>
-      </w:pPr>
-      <w:r>
-        <w:rPr>
-          <w:rFonts w:ascii="Arial" w:cs="Arial" w:eastAsia="Arial" w:hAnsi="Arial"/>
+        <w:t xml:space="preserve">16 to 9 wks</w:t>
+      </w:r>
+      <w:r>
+        <w:rPr>
+          <w:rFonts w:ascii="Arial" w:cs="Arial" w:eastAsia="Arial" w:hAnsi="Arial"/>
+          <w:color w:val="666666"/>
           <w:sz w:val="18"/>
           <w:szCs w:val="18"/>
         </w:rPr>
-        <w:t xml:space="preserve">Charlotte, NC  |  (704) 555-0142  |  jordan.rivera@example.com  |  linkedin.com/in/jordan-rivera-example</w:t>
-      </w:r>
-    </w:p>
-    <w:p>
-      <w:pPr>
-        <w:pBdr>
-          <w:top w:val="single" w:color="E6EAF1" w:sz="4" w:space="4"/>
-          <w:bottom w:val="single" w:color="E6EAF1" w:sz="4" w:space="4"/>
-        </w:pBdr>
-        <w:shd w:fill="E6EAF1" w:color="auto" w:val="clear"/>
-        <w:spacing w:after="120" w:before="0"/>
-        <w:jc w:val="center"/>
-      </w:pPr>
-      <w:r>
-        <w:rPr>
-          <w:rFonts w:ascii="Arial" w:cs="Arial" w:eastAsia="Arial" w:hAnsi="Arial"/>
-          <w:b/>
-          <w:bCs/>
-          <w:color w:val="1A2B4A"/>
-          <w:sz w:val="20"/>
-          <w:szCs w:val="20"/>
-        </w:rPr>
-        <w:t xml:space="preserve">16 to 9 wks</w:t>
-      </w:r>
-      <w:r>
-        <w:rPr>
-          <w:rFonts w:ascii="Arial" w:cs="Arial" w:eastAsia="Arial" w:hAnsi="Arial"/>
+        <w:t xml:space="preserve"> go-live time</w:t>
+      </w:r>
+      <w:r>
+        <w:rPr>
+          <w:rFonts w:ascii="Arial" w:cs="Arial" w:eastAsia="Arial" w:hAnsi="Arial"/>
+          <w:color w:val="9AA3B8"/>
+          <w:sz w:val="19"/>
+          <w:szCs w:val="19"/>
+        </w:rPr>
+        <w:t xml:space="preserve">   |   </w:t>
+      </w:r>
+      <w:r>
+        <w:rPr>
+          <w:rFonts w:ascii="Arial" w:cs="Arial" w:eastAsia="Arial" w:hAnsi="Arial"/>
+          <w:b/>
+          <w:bCs/>
+          <w:color w:val="1A2B4A"/>
+          <w:sz w:val="22"/>
+          <w:szCs w:val="22"/>
+        </w:rPr>
+        <w:t xml:space="preserve">95%</w:t>
+      </w:r>
+      <w:r>
+        <w:rPr>
+          <w:rFonts w:ascii="Arial" w:cs="Arial" w:eastAsia="Arial" w:hAnsi="Arial"/>
+          <w:color w:val="666666"/>
           <w:sz w:val="18"/>
           <w:szCs w:val="18"/>
         </w:rPr>
-        <w:t xml:space="preserve"> implementation time</w:t>
-      </w:r>
-      <w:r>
-        <w:rPr>
-          <w:rFonts w:ascii="Arial" w:cs="Arial" w:eastAsia="Arial" w:hAnsi="Arial"/>
-          <w:color w:val="1A2B4A"/>
+        <w:t xml:space="preserve"> revenue retention</w:t>
+      </w:r>
+      <w:r>
+        <w:rPr>
+          <w:rFonts w:ascii="Arial" w:cs="Arial" w:eastAsia="Arial" w:hAnsi="Arial"/>
+          <w:color w:val="9AA3B8"/>
           <w:sz w:val="19"/>
           <w:szCs w:val="19"/>
         </w:rPr>
@@ -93,23 +197,24 @@
           <w:b/>
           <w:bCs/>
           <w:color w:val="1A2B4A"/>
-          <w:sz w:val="20"/>
-          <w:szCs w:val="20"/>
-        </w:rPr>
-        <w:t xml:space="preserve">95%</w:t>
-      </w:r>
-      <w:r>
-        <w:rPr>
-          <w:rFonts w:ascii="Arial" w:cs="Arial" w:eastAsia="Arial" w:hAnsi="Arial"/>
+          <w:sz w:val="22"/>
+          <w:szCs w:val="22"/>
+        </w:rPr>
+        <w:t xml:space="preserve">$11.2M</w:t>
+      </w:r>
+      <w:r>
+        <w:rPr>
+          <w:rFonts w:ascii="Arial" w:cs="Arial" w:eastAsia="Arial" w:hAnsi="Arial"/>
+          <w:color w:val="666666"/>
           <w:sz w:val="18"/>
           <w:szCs w:val="18"/>
         </w:rPr>
-        <w:t xml:space="preserve"> revenue retention</w:t>
-      </w:r>
-      <w:r>
-        <w:rPr>
-          <w:rFonts w:ascii="Arial" w:cs="Arial" w:eastAsia="Arial" w:hAnsi="Arial"/>
-          <w:color w:val="1A2B4A"/>
+        <w:t xml:space="preserve"> budget</w:t>
+      </w:r>
+      <w:r>
+        <w:rPr>
+          <w:rFonts w:ascii="Arial" w:cs="Arial" w:eastAsia="Arial" w:hAnsi="Arial"/>
+          <w:color w:val="9AA3B8"/>
           <w:sz w:val="19"/>
           <w:szCs w:val="19"/>
         </w:rPr>
@@ -121,46 +226,19 @@
           <w:b/>
           <w:bCs/>
           <w:color w:val="1A2B4A"/>
-          <w:sz w:val="20"/>
-          <w:szCs w:val="20"/>
-        </w:rPr>
-        <w:t xml:space="preserve">$11.2M</w:t>
-      </w:r>
-      <w:r>
-        <w:rPr>
-          <w:rFonts w:ascii="Arial" w:cs="Arial" w:eastAsia="Arial" w:hAnsi="Arial"/>
+          <w:sz w:val="22"/>
+          <w:szCs w:val="22"/>
+        </w:rPr>
+        <w:t xml:space="preserve">31 to 12 hrs</w:t>
+      </w:r>
+      <w:r>
+        <w:rPr>
+          <w:rFonts w:ascii="Arial" w:cs="Arial" w:eastAsia="Arial" w:hAnsi="Arial"/>
+          <w:color w:val="666666"/>
           <w:sz w:val="18"/>
           <w:szCs w:val="18"/>
         </w:rPr>
-        <w:t xml:space="preserve"> budget, 64 people</w:t>
-      </w:r>
-      <w:r>
-        <w:rPr>
-          <w:rFonts w:ascii="Arial" w:cs="Arial" w:eastAsia="Arial" w:hAnsi="Arial"/>
-          <w:color w:val="1A2B4A"/>
-          <w:sz w:val="19"/>
-          <w:szCs w:val="19"/>
-        </w:rPr>
-        <w:t xml:space="preserve">   |   </w:t>
-      </w:r>
-      <w:r>
-        <w:rPr>
-          <w:rFonts w:ascii="Arial" w:cs="Arial" w:eastAsia="Arial" w:hAnsi="Arial"/>
-          <w:b/>
-          <w:bCs/>
-          <w:color w:val="1A2B4A"/>
-          <w:sz w:val="20"/>
-          <w:szCs w:val="20"/>
-        </w:rPr>
-        <w:t xml:space="preserve">31 to 12 hrs</w:t>
-      </w:r>
-      <w:r>
-        <w:rPr>
-          <w:rFonts w:ascii="Arial" w:cs="Arial" w:eastAsia="Arial" w:hAnsi="Arial"/>
-          <w:sz w:val="18"/>
-          <w:szCs w:val="18"/>
-        </w:rPr>
-        <w:t xml:space="preserve"> ticket resolution</w:t>
+        <w:t xml:space="preserve"> resolution</w:t>
       </w:r>
     </w:p>
     <w:p>
@@ -168,17 +246,16 @@
         <w:keepNext/>
         <w:keepLines/>
         <w:pBdr>
-          <w:bottom w:val="single" w:color="1A2B4A" w:sz="8" w:space="2"/>
+          <w:bottom w:val="single" w:color="1A2B4A" w:sz="4" w:space="3"/>
         </w:pBdr>
-        <w:spacing w:after="60" w:before="160"/>
-      </w:pPr>
-      <w:r>
-        <w:rPr>
-          <w:rFonts w:ascii="Arial" w:cs="Arial" w:eastAsia="Arial" w:hAnsi="Arial"/>
-          <w:b/>
-          <w:bCs/>
-          <w:color w:val="1A2B4A"/>
-          <w:spacing w:val="20"/>
+        <w:spacing w:after="80" w:before="220"/>
+      </w:pPr>
+      <w:r>
+        <w:rPr>
+          <w:rFonts w:ascii="Arial" w:cs="Arial" w:eastAsia="Arial" w:hAnsi="Arial"/>
+          <w:b/>
+          <w:bCs/>
+          <w:color w:val="1A2B4A"/>
           <w:sz w:val="21"/>
           <w:szCs w:val="21"/>
         </w:rPr>
@@ -188,13 +265,14 @@
     <w:p>
       <w:pPr>
         <w:keepLines/>
-        <w:spacing w:after="80"/>
-      </w:pPr>
-      <w:r>
-        <w:rPr>
-          <w:rFonts w:ascii="Arial" w:cs="Arial" w:eastAsia="Arial" w:hAnsi="Arial"/>
-          <w:sz w:val="21"/>
-          <w:szCs w:val="21"/>
+        <w:spacing w:after="90" w:line="270"/>
+      </w:pPr>
+      <w:r>
+        <w:rPr>
+          <w:rFonts w:ascii="Arial" w:cs="Arial" w:eastAsia="Arial" w:hAnsi="Arial"/>
+          <w:color w:val="1A1A1A"/>
+          <w:sz w:val="20"/>
+          <w:szCs w:val="20"/>
         </w:rPr>
         <w:t xml:space="preserve">Operations leader with 14 years in logistics software, ready to help Harborline reach its goal of "live in 60 days, every customer." I run implementation, support, and training for a 420-person transportation software company, where my team cut average implementation time from 16 weeks to 9 weeks.</w:t>
       </w:r>
@@ -202,13 +280,14 @@
     <w:p>
       <w:pPr>
         <w:keepLines/>
-        <w:spacing w:after="80"/>
-      </w:pPr>
-      <w:r>
-        <w:rPr>
-          <w:rFonts w:ascii="Arial" w:cs="Arial" w:eastAsia="Arial" w:hAnsi="Arial"/>
-          <w:sz w:val="21"/>
-          <w:szCs w:val="21"/>
+        <w:spacing w:after="90" w:line="270"/>
+      </w:pPr>
+      <w:r>
+        <w:rPr>
+          <w:rFonts w:ascii="Arial" w:cs="Arial" w:eastAsia="Arial" w:hAnsi="Arial"/>
+          <w:color w:val="1A1A1A"/>
+          <w:sz w:val="20"/>
+          <w:szCs w:val="20"/>
         </w:rPr>
         <w:t xml:space="preserve">Known for plain metrics, weekly operating rhythms, and teams that keep their best people. Comfortable with acquisitions, fast growth, and boards that want the numbers straight.</w:t>
       </w:r>
@@ -218,17 +297,16 @@
         <w:keepNext/>
         <w:keepLines/>
         <w:pBdr>
-          <w:bottom w:val="single" w:color="1A2B4A" w:sz="8" w:space="2"/>
+          <w:bottom w:val="single" w:color="1A2B4A" w:sz="4" w:space="3"/>
         </w:pBdr>
-        <w:spacing w:after="60" w:before="160"/>
-      </w:pPr>
-      <w:r>
-        <w:rPr>
-          <w:rFonts w:ascii="Arial" w:cs="Arial" w:eastAsia="Arial" w:hAnsi="Arial"/>
-          <w:b/>
-          <w:bCs/>
-          <w:color w:val="1A2B4A"/>
-          <w:spacing w:val="20"/>
+        <w:spacing w:after="80" w:before="220"/>
+      </w:pPr>
+      <w:r>
+        <w:rPr>
+          <w:rFonts w:ascii="Arial" w:cs="Arial" w:eastAsia="Arial" w:hAnsi="Arial"/>
+          <w:b/>
+          <w:bCs/>
+          <w:color w:val="1A2B4A"/>
           <w:sz w:val="21"/>
           <w:szCs w:val="21"/>
         </w:rPr>
@@ -244,13 +322,25 @@
           <w:ilvl w:val="0"/>
           <w:numId w:val="2"/>
         </w:numPr>
-        <w:spacing w:after="40"/>
-      </w:pPr>
-      <w:r>
-        <w:rPr>
-          <w:rFonts w:ascii="Arial" w:cs="Arial" w:eastAsia="Arial" w:hAnsi="Arial"/>
-          <w:sz w:val="21"/>
-          <w:szCs w:val="21"/>
+        <w:spacing w:after="70" w:line="270"/>
+      </w:pPr>
+      <w:r>
+        <w:rPr>
+          <w:rFonts w:ascii="Arial" w:cs="Arial" w:eastAsia="Arial" w:hAnsi="Arial"/>
+          <w:b/>
+          <w:bCs/>
+          <w:color w:val="1A1A1A"/>
+          <w:sz w:val="20"/>
+          <w:szCs w:val="20"/>
+        </w:rPr>
+        <w:t xml:space="preserve">Faster go-lives. </w:t>
+      </w:r>
+      <w:r>
+        <w:rPr>
+          <w:rFonts w:ascii="Arial" w:cs="Arial" w:eastAsia="Arial" w:hAnsi="Arial"/>
+          <w:color w:val="1A1A1A"/>
+          <w:sz w:val="20"/>
+          <w:szCs w:val="20"/>
         </w:rPr>
         <w:t xml:space="preserve">Cut average implementation time from 16 weeks to 9 weeks at Tidewater Freight Systems by rebuilding onboarding around three standard tiers.</w:t>
       </w:r>
@@ -264,13 +354,25 @@
           <w:ilvl w:val="0"/>
           <w:numId w:val="2"/>
         </w:numPr>
-        <w:spacing w:after="40"/>
-      </w:pPr>
-      <w:r>
-        <w:rPr>
-          <w:rFonts w:ascii="Arial" w:cs="Arial" w:eastAsia="Arial" w:hAnsi="Arial"/>
-          <w:sz w:val="21"/>
-          <w:szCs w:val="21"/>
+        <w:spacing w:after="70" w:line="270"/>
+      </w:pPr>
+      <w:r>
+        <w:rPr>
+          <w:rFonts w:ascii="Arial" w:cs="Arial" w:eastAsia="Arial" w:hAnsi="Arial"/>
+          <w:b/>
+          <w:bCs/>
+          <w:color w:val="1A1A1A"/>
+          <w:sz w:val="20"/>
+          <w:szCs w:val="20"/>
+        </w:rPr>
+        <w:t xml:space="preserve">Customers stay. </w:t>
+      </w:r>
+      <w:r>
+        <w:rPr>
+          <w:rFonts w:ascii="Arial" w:cs="Arial" w:eastAsia="Arial" w:hAnsi="Arial"/>
+          <w:color w:val="1A1A1A"/>
+          <w:sz w:val="20"/>
+          <w:szCs w:val="20"/>
         </w:rPr>
         <w:t xml:space="preserve">Helped raise gross revenue retention from 89% to 95% in three years by pairing implementation leads with account owners through the first renewal.</w:t>
       </w:r>
@@ -284,13 +386,25 @@
           <w:ilvl w:val="0"/>
           <w:numId w:val="2"/>
         </w:numPr>
-        <w:spacing w:after="40"/>
-      </w:pPr>
-      <w:r>
-        <w:rPr>
-          <w:rFonts w:ascii="Arial" w:cs="Arial" w:eastAsia="Arial" w:hAnsi="Arial"/>
-          <w:sz w:val="21"/>
-          <w:szCs w:val="21"/>
+        <w:spacing w:after="70" w:line="270"/>
+      </w:pPr>
+      <w:r>
+        <w:rPr>
+          <w:rFonts w:ascii="Arial" w:cs="Arial" w:eastAsia="Arial" w:hAnsi="Arial"/>
+          <w:b/>
+          <w:bCs/>
+          <w:color w:val="1A1A1A"/>
+          <w:sz w:val="20"/>
+          <w:szCs w:val="20"/>
+        </w:rPr>
+        <w:t xml:space="preserve">Acquisition integration. </w:t>
+      </w:r>
+      <w:r>
+        <w:rPr>
+          <w:rFonts w:ascii="Arial" w:cs="Arial" w:eastAsia="Arial" w:hAnsi="Arial"/>
+          <w:color w:val="1A1A1A"/>
+          <w:sz w:val="20"/>
+          <w:szCs w:val="20"/>
         </w:rPr>
         <w:t xml:space="preserve">Integrated an acquired company's 38 employees and 120 customers onto one support platform in 7 months and kept 97% of acquired customers through year one.</w:t>
       </w:r>
@@ -304,13 +418,25 @@
           <w:ilvl w:val="0"/>
           <w:numId w:val="2"/>
         </w:numPr>
-        <w:spacing w:after="40"/>
-      </w:pPr>
-      <w:r>
-        <w:rPr>
-          <w:rFonts w:ascii="Arial" w:cs="Arial" w:eastAsia="Arial" w:hAnsi="Arial"/>
-          <w:sz w:val="21"/>
-          <w:szCs w:val="21"/>
+        <w:spacing w:after="70" w:line="270"/>
+      </w:pPr>
+      <w:r>
+        <w:rPr>
+          <w:rFonts w:ascii="Arial" w:cs="Arial" w:eastAsia="Arial" w:hAnsi="Arial"/>
+          <w:b/>
+          <w:bCs/>
+          <w:color w:val="1A1A1A"/>
+          <w:sz w:val="20"/>
+          <w:szCs w:val="20"/>
+        </w:rPr>
+        <w:t xml:space="preserve">Team built from 6. </w:t>
+      </w:r>
+      <w:r>
+        <w:rPr>
+          <w:rFonts w:ascii="Arial" w:cs="Arial" w:eastAsia="Arial" w:hAnsi="Arial"/>
+          <w:color w:val="1A1A1A"/>
+          <w:sz w:val="20"/>
+          <w:szCs w:val="20"/>
         </w:rPr>
         <w:t xml:space="preserve">Built Kestrel Route Software's implementation team from 6 to 23 people and onboarded 140 new customers in 2017 and 2018.</w:t>
       </w:r>
@@ -324,15 +450,241 @@
           <w:ilvl w:val="0"/>
           <w:numId w:val="2"/>
         </w:numPr>
-        <w:spacing w:after="40"/>
-      </w:pPr>
-      <w:r>
-        <w:rPr>
-          <w:rFonts w:ascii="Arial" w:cs="Arial" w:eastAsia="Arial" w:hAnsi="Arial"/>
+        <w:spacing w:after="70" w:line="270"/>
+      </w:pPr>
+      <w:r>
+        <w:rPr>
+          <w:rFonts w:ascii="Arial" w:cs="Arial" w:eastAsia="Arial" w:hAnsi="Arial"/>
+          <w:b/>
+          <w:bCs/>
+          <w:color w:val="1A1A1A"/>
+          <w:sz w:val="20"/>
+          <w:szCs w:val="20"/>
+        </w:rPr>
+        <w:t xml:space="preserve">On time, every day. </w:t>
+      </w:r>
+      <w:r>
+        <w:rPr>
+          <w:rFonts w:ascii="Arial" w:cs="Arial" w:eastAsia="Arial" w:hAnsi="Arial"/>
+          <w:color w:val="1A1A1A"/>
+          <w:sz w:val="20"/>
+          <w:szCs w:val="20"/>
+        </w:rPr>
+        <w:t xml:space="preserve">Raised on-time shipment rate from 91% to 98.5% across two distribution centers at Brightpine Distribution.</w:t>
+      </w:r>
+    </w:p>
+    <w:p>
+      <w:pPr>
+        <w:keepNext/>
+        <w:keepLines/>
+        <w:pBdr>
+          <w:bottom w:val="single" w:color="1A2B4A" w:sz="4" w:space="3"/>
+        </w:pBdr>
+        <w:spacing w:after="80" w:before="220"/>
+      </w:pPr>
+      <w:r>
+        <w:rPr>
+          <w:rFonts w:ascii="Arial" w:cs="Arial" w:eastAsia="Arial" w:hAnsi="Arial"/>
+          <w:b/>
+          <w:bCs/>
+          <w:color w:val="1A2B4A"/>
           <w:sz w:val="21"/>
           <w:szCs w:val="21"/>
         </w:rPr>
-        <w:t xml:space="preserve">Raised on-time shipment rate from 91% to 98.5% across two distribution centers at Brightpine Distribution.</w:t>
+        <w:t xml:space="preserve">CORE COMPETENCIES</w:t>
+      </w:r>
+    </w:p>
+    <w:p>
+      <w:pPr>
+        <w:keepLines/>
+        <w:spacing w:after="40" w:line="280"/>
+      </w:pPr>
+      <w:r>
+        <w:rPr>
+          <w:rFonts w:ascii="Arial" w:cs="Arial" w:eastAsia="Arial" w:hAnsi="Arial"/>
+          <w:b/>
+          <w:bCs/>
+          <w:color w:val="1A2B4A"/>
+          <w:sz w:val="19"/>
+          <w:szCs w:val="19"/>
+        </w:rPr>
+        <w:t xml:space="preserve">SaaS Operations</w:t>
+      </w:r>
+      <w:r>
+        <w:rPr>
+          <w:rFonts w:ascii="Arial" w:cs="Arial" w:eastAsia="Arial" w:hAnsi="Arial"/>
+          <w:b/>
+          <w:bCs/>
+          <w:color w:val="1A2B4A"/>
+          <w:sz w:val="19"/>
+          <w:szCs w:val="19"/>
+        </w:rPr>
+        <w:t xml:space="preserve">  |  </w:t>
+      </w:r>
+      <w:r>
+        <w:rPr>
+          <w:rFonts w:ascii="Arial" w:cs="Arial" w:eastAsia="Arial" w:hAnsi="Arial"/>
+          <w:b/>
+          <w:bCs/>
+          <w:color w:val="1A2B4A"/>
+          <w:sz w:val="19"/>
+          <w:szCs w:val="19"/>
+        </w:rPr>
+        <w:t xml:space="preserve">Implementation</w:t>
+      </w:r>
+      <w:r>
+        <w:rPr>
+          <w:rFonts w:ascii="Arial" w:cs="Arial" w:eastAsia="Arial" w:hAnsi="Arial"/>
+          <w:b/>
+          <w:bCs/>
+          <w:color w:val="1A2B4A"/>
+          <w:sz w:val="19"/>
+          <w:szCs w:val="19"/>
+        </w:rPr>
+        <w:t xml:space="preserve">  |  </w:t>
+      </w:r>
+      <w:r>
+        <w:rPr>
+          <w:rFonts w:ascii="Arial" w:cs="Arial" w:eastAsia="Arial" w:hAnsi="Arial"/>
+          <w:b/>
+          <w:bCs/>
+          <w:color w:val="1A2B4A"/>
+          <w:sz w:val="19"/>
+          <w:szCs w:val="19"/>
+        </w:rPr>
+        <w:t xml:space="preserve">Customer Support</w:t>
+      </w:r>
+      <w:r>
+        <w:rPr>
+          <w:rFonts w:ascii="Arial" w:cs="Arial" w:eastAsia="Arial" w:hAnsi="Arial"/>
+          <w:b/>
+          <w:bCs/>
+          <w:color w:val="1A2B4A"/>
+          <w:sz w:val="19"/>
+          <w:szCs w:val="19"/>
+        </w:rPr>
+        <w:t xml:space="preserve">  |  </w:t>
+      </w:r>
+      <w:r>
+        <w:rPr>
+          <w:rFonts w:ascii="Arial" w:cs="Arial" w:eastAsia="Arial" w:hAnsi="Arial"/>
+          <w:b/>
+          <w:bCs/>
+          <w:color w:val="1A2B4A"/>
+          <w:sz w:val="19"/>
+          <w:szCs w:val="19"/>
+        </w:rPr>
+        <w:t xml:space="preserve">Revenue Retention</w:t>
+      </w:r>
+      <w:r>
+        <w:rPr>
+          <w:rFonts w:ascii="Arial" w:cs="Arial" w:eastAsia="Arial" w:hAnsi="Arial"/>
+          <w:b/>
+          <w:bCs/>
+          <w:color w:val="1A2B4A"/>
+          <w:sz w:val="19"/>
+          <w:szCs w:val="19"/>
+        </w:rPr>
+        <w:t xml:space="preserve">  |  </w:t>
+      </w:r>
+      <w:r>
+        <w:rPr>
+          <w:rFonts w:ascii="Arial" w:cs="Arial" w:eastAsia="Arial" w:hAnsi="Arial"/>
+          <w:b/>
+          <w:bCs/>
+          <w:color w:val="1A2B4A"/>
+          <w:sz w:val="19"/>
+          <w:szCs w:val="19"/>
+        </w:rPr>
+        <w:t xml:space="preserve">M&amp;A Integration</w:t>
+      </w:r>
+      <w:r>
+        <w:rPr>
+          <w:rFonts w:ascii="Arial" w:cs="Arial" w:eastAsia="Arial" w:hAnsi="Arial"/>
+          <w:b/>
+          <w:bCs/>
+          <w:color w:val="1A2B4A"/>
+          <w:sz w:val="19"/>
+          <w:szCs w:val="19"/>
+        </w:rPr>
+        <w:t xml:space="preserve">  |  </w:t>
+      </w:r>
+      <w:r>
+        <w:rPr>
+          <w:rFonts w:ascii="Arial" w:cs="Arial" w:eastAsia="Arial" w:hAnsi="Arial"/>
+          <w:b/>
+          <w:bCs/>
+          <w:color w:val="1A2B4A"/>
+          <w:sz w:val="19"/>
+          <w:szCs w:val="19"/>
+        </w:rPr>
+        <w:t xml:space="preserve">Process Design</w:t>
+      </w:r>
+      <w:r>
+        <w:rPr>
+          <w:rFonts w:ascii="Arial" w:cs="Arial" w:eastAsia="Arial" w:hAnsi="Arial"/>
+          <w:b/>
+          <w:bCs/>
+          <w:color w:val="1A2B4A"/>
+          <w:sz w:val="19"/>
+          <w:szCs w:val="19"/>
+        </w:rPr>
+        <w:t xml:space="preserve">  |  </w:t>
+      </w:r>
+      <w:r>
+        <w:rPr>
+          <w:rFonts w:ascii="Arial" w:cs="Arial" w:eastAsia="Arial" w:hAnsi="Arial"/>
+          <w:b/>
+          <w:bCs/>
+          <w:color w:val="1A2B4A"/>
+          <w:sz w:val="19"/>
+          <w:szCs w:val="19"/>
+        </w:rPr>
+        <w:t xml:space="preserve">Budget Ownership</w:t>
+      </w:r>
+      <w:r>
+        <w:rPr>
+          <w:rFonts w:ascii="Arial" w:cs="Arial" w:eastAsia="Arial" w:hAnsi="Arial"/>
+          <w:b/>
+          <w:bCs/>
+          <w:color w:val="1A2B4A"/>
+          <w:sz w:val="19"/>
+          <w:szCs w:val="19"/>
+        </w:rPr>
+        <w:t xml:space="preserve">  |  </w:t>
+      </w:r>
+      <w:r>
+        <w:rPr>
+          <w:rFonts w:ascii="Arial" w:cs="Arial" w:eastAsia="Arial" w:hAnsi="Arial"/>
+          <w:b/>
+          <w:bCs/>
+          <w:color w:val="1A2B4A"/>
+          <w:sz w:val="19"/>
+          <w:szCs w:val="19"/>
+        </w:rPr>
+        <w:t xml:space="preserve">KPI Design</w:t>
+      </w:r>
+      <w:r>
+        <w:rPr>
+          <w:rFonts w:ascii="Arial" w:cs="Arial" w:eastAsia="Arial" w:hAnsi="Arial"/>
+          <w:b/>
+          <w:bCs/>
+          <w:color w:val="1A2B4A"/>
+          <w:sz w:val="19"/>
+          <w:szCs w:val="19"/>
+        </w:rPr>
+        <w:t xml:space="preserve">  |  </w:t>
+      </w:r>
+      <w:r>
+        <w:rPr>
+          <w:rFonts w:ascii="Arial" w:cs="Arial" w:eastAsia="Arial" w:hAnsi="Arial"/>
+          <w:b/>
+          <w:bCs/>
+          <w:color w:val="1A2B4A"/>
+          <w:sz w:val="19"/>
+          <w:szCs w:val="19"/>
+        </w:rPr>
+        <w:t xml:space="preserve">Team Building</w:t>
       </w:r>
     </w:p>
     <w:p>
@@ -340,193 +692,134 @@
         <w:keepNext/>
         <w:keepLines/>
         <w:pBdr>
-          <w:bottom w:val="single" w:color="1A2B4A" w:sz="8" w:space="2"/>
+          <w:bottom w:val="single" w:color="1A2B4A" w:sz="4" w:space="3"/>
         </w:pBdr>
-        <w:spacing w:after="60" w:before="160"/>
-      </w:pPr>
-      <w:r>
-        <w:rPr>
-          <w:rFonts w:ascii="Arial" w:cs="Arial" w:eastAsia="Arial" w:hAnsi="Arial"/>
-          <w:b/>
-          <w:bCs/>
-          <w:color w:val="1A2B4A"/>
-          <w:spacing w:val="20"/>
+        <w:spacing w:after="80" w:before="220"/>
+      </w:pPr>
+      <w:r>
+        <w:rPr>
+          <w:rFonts w:ascii="Arial" w:cs="Arial" w:eastAsia="Arial" w:hAnsi="Arial"/>
+          <w:b/>
+          <w:bCs/>
+          <w:color w:val="1A2B4A"/>
           <w:sz w:val="21"/>
           <w:szCs w:val="21"/>
         </w:rPr>
-        <w:t xml:space="preserve">CORE COMPETENCIES</w:t>
-      </w:r>
-    </w:p>
-    <w:p>
-      <w:pPr>
-        <w:keepLines/>
-        <w:spacing w:after="80"/>
-      </w:pPr>
-      <w:r>
-        <w:rPr>
-          <w:rFonts w:ascii="Arial" w:cs="Arial" w:eastAsia="Arial" w:hAnsi="Arial"/>
-          <w:sz w:val="21"/>
-          <w:szCs w:val="21"/>
-        </w:rPr>
-        <w:t xml:space="preserve">SaaS Operations  |  Implementation  |  Customer Support  |  Revenue Retention  |  M&amp;A Integration  |  Process Design  |  Budget Ownership  |  KPI Design  |  Team Building</w:t>
+        <w:t xml:space="preserve">PROFESSIONAL EXPERIENCE</w:t>
       </w:r>
     </w:p>
     <w:p>
       <w:pPr>
         <w:keepNext/>
         <w:keepLines/>
-        <w:pBdr>
-          <w:bottom w:val="single" w:color="1A2B4A" w:sz="8" w:space="2"/>
-        </w:pBdr>
-        <w:spacing w:after="60" w:before="160"/>
-      </w:pPr>
-      <w:r>
-        <w:rPr>
-          <w:rFonts w:ascii="Arial" w:cs="Arial" w:eastAsia="Arial" w:hAnsi="Arial"/>
-          <w:b/>
-          <w:bCs/>
-          <w:color w:val="1A2B4A"/>
-          <w:spacing w:val="20"/>
-          <w:sz w:val="21"/>
-          <w:szCs w:val="21"/>
-        </w:rPr>
-        <w:t xml:space="preserve">EXPERIENCE</w:t>
+        <w:tabs>
+          <w:tab w:val="right" w:pos="10440"/>
+        </w:tabs>
+        <w:spacing w:after="0" w:before="0"/>
+      </w:pPr>
+      <w:r>
+        <w:rPr>
+          <w:rFonts w:ascii="Arial" w:cs="Arial" w:eastAsia="Arial" w:hAnsi="Arial"/>
+          <w:b/>
+          <w:bCs/>
+          <w:color w:val="1A2B4A"/>
+          <w:sz w:val="20"/>
+          <w:szCs w:val="20"/>
+        </w:rPr>
+        <w:t xml:space="preserve">Director of Operations</w:t>
+      </w:r>
+      <w:r>
+        <w:rPr>
+          <w:rFonts w:ascii="Arial" w:cs="Arial" w:eastAsia="Arial" w:hAnsi="Arial"/>
+          <w:color w:val="666666"/>
+          <w:sz w:val="19"/>
+          <w:szCs w:val="19"/>
+        </w:rPr>
+        <w:t xml:space="preserve">	01/2021 to Present</w:t>
       </w:r>
     </w:p>
     <w:p>
       <w:pPr>
         <w:keepNext/>
         <w:keepLines/>
-        <w:tabs>
-          <w:tab w:val="right" w:pos="10800"/>
-        </w:tabs>
-        <w:spacing w:after="0" w:before="100"/>
-      </w:pPr>
-      <w:r>
-        <w:rPr>
-          <w:rFonts w:ascii="Arial" w:cs="Arial" w:eastAsia="Arial" w:hAnsi="Arial"/>
-          <w:b/>
-          <w:bCs/>
-          <w:color w:val="1A2B4A"/>
-          <w:sz w:val="21"/>
-          <w:szCs w:val="21"/>
-        </w:rPr>
-        <w:t xml:space="preserve">Tidewater Freight Systems</w:t>
-      </w:r>
-      <w:r>
-        <w:rPr>
-          <w:rFonts w:ascii="Arial" w:cs="Arial" w:eastAsia="Arial" w:hAnsi="Arial"/>
-          <w:sz w:val="20"/>
-          <w:szCs w:val="20"/>
-        </w:rPr>
-        <w:t xml:space="preserve">, Charlotte, NC</w:t>
-      </w:r>
-      <w:r>
-        <w:rPr>
-          <w:rFonts w:ascii="Arial" w:cs="Arial" w:eastAsia="Arial" w:hAnsi="Arial"/>
-          <w:sz w:val="19"/>
-          <w:szCs w:val="19"/>
-        </w:rPr>
-        <w:t xml:space="preserve">	03/2019 to Present</w:t>
+        <w:spacing w:after="30"/>
+      </w:pPr>
+      <w:r>
+        <w:rPr>
+          <w:rFonts w:ascii="Arial" w:cs="Arial" w:eastAsia="Arial" w:hAnsi="Arial"/>
+          <w:b/>
+          <w:bCs/>
+          <w:color w:val="1A1A1A"/>
+          <w:sz w:val="20"/>
+          <w:szCs w:val="20"/>
+        </w:rPr>
+        <w:t xml:space="preserve">Tidewater Freight Systems, Charlotte, NC</w:t>
       </w:r>
     </w:p>
     <w:p>
       <w:pPr>
         <w:keepNext/>
         <w:keepLines/>
-        <w:tabs>
-          <w:tab w:val="right" w:pos="10800"/>
-        </w:tabs>
-        <w:spacing w:after="0"/>
-      </w:pPr>
-      <w:r>
-        <w:rPr>
-          <w:rFonts w:ascii="Arial" w:cs="Arial" w:eastAsia="Arial" w:hAnsi="Arial"/>
-          <w:b/>
-          <w:bCs/>
+        <w:spacing w:after="40" w:line="250"/>
+      </w:pPr>
+      <w:r>
+        <w:rPr>
+          <w:rFonts w:ascii="Arial" w:cs="Arial" w:eastAsia="Arial" w:hAnsi="Arial"/>
           <w:i/>
           <w:iCs/>
-          <w:sz w:val="21"/>
-          <w:szCs w:val="21"/>
-        </w:rPr>
-        <w:t xml:space="preserve">Director of Operations</w:t>
+          <w:color w:val="666666"/>
+          <w:sz w:val="19"/>
+          <w:szCs w:val="19"/>
+        </w:rPr>
+        <w:t xml:space="preserve">Transportation management software for mid-market shippers and carriers. About 420 employees.</w:t>
+      </w:r>
+    </w:p>
+    <w:p>
+      <w:pPr>
+        <w:keepNext/>
+        <w:keepLines/>
+        <w:spacing w:after="50" w:line="250"/>
+      </w:pPr>
+      <w:r>
+        <w:rPr>
+          <w:rFonts w:ascii="Arial" w:cs="Arial" w:eastAsia="Arial" w:hAnsi="Arial"/>
+          <w:b/>
+          <w:bCs/>
+          <w:color w:val="1A1A1A"/>
+          <w:sz w:val="19"/>
+          <w:szCs w:val="19"/>
+        </w:rPr>
+        <w:t xml:space="preserve">Mandate: </w:t>
       </w:r>
       <w:r>
         <w:rPr>
           <w:rFonts w:ascii="Arial" w:cs="Arial" w:eastAsia="Arial" w:hAnsi="Arial"/>
           <w:i/>
           <w:iCs/>
-          <w:sz w:val="18"/>
-          <w:szCs w:val="18"/>
-        </w:rPr>
-        <w:t xml:space="preserve">	01/2021 to Present</w:t>
-      </w:r>
-    </w:p>
-    <w:p>
-      <w:pPr>
-        <w:keepNext/>
-        <w:keepLines/>
-        <w:tabs>
-          <w:tab w:val="right" w:pos="10800"/>
-        </w:tabs>
-        <w:spacing w:after="0"/>
-      </w:pPr>
-      <w:r>
-        <w:rPr>
-          <w:rFonts w:ascii="Arial" w:cs="Arial" w:eastAsia="Arial" w:hAnsi="Arial"/>
-          <w:b/>
-          <w:bCs/>
-          <w:i/>
-          <w:iCs/>
-          <w:sz w:val="21"/>
-          <w:szCs w:val="21"/>
-        </w:rPr>
-        <w:t xml:space="preserve">Senior Manager, Customer Operations</w:t>
-      </w:r>
-      <w:r>
-        <w:rPr>
-          <w:rFonts w:ascii="Arial" w:cs="Arial" w:eastAsia="Arial" w:hAnsi="Arial"/>
-          <w:i/>
-          <w:iCs/>
-          <w:sz w:val="18"/>
-          <w:szCs w:val="18"/>
-        </w:rPr>
-        <w:t xml:space="preserve">	03/2019 to 12/2020</w:t>
-      </w:r>
-    </w:p>
-    <w:p>
-      <w:pPr>
-        <w:keepNext/>
-        <w:spacing w:after="40"/>
-      </w:pPr>
-      <w:r>
-        <w:rPr>
-          <w:rFonts w:ascii="Arial" w:cs="Arial" w:eastAsia="Arial" w:hAnsi="Arial"/>
-          <w:i/>
-          <w:iCs/>
-          <w:color w:val="444444"/>
-          <w:sz w:val="18"/>
-          <w:szCs w:val="18"/>
-        </w:rPr>
-        <w:t xml:space="preserve">Transportation management software for mid-market shippers and carriers. About 420 employees.</w:t>
+          <w:color w:val="1A1A1A"/>
+          <w:sz w:val="19"/>
+          <w:szCs w:val="19"/>
+        </w:rPr>
+        <w:t xml:space="preserve">Hired to rebuild the post-sale team after a year of slow go-lives and rising churn.</w:t>
       </w:r>
     </w:p>
     <w:p>
       <w:pPr>
         <w:pStyle w:val="ListParagraph"/>
-        <w:keepNext/>
+        <w:keepNext w:val="false"/>
         <w:keepLines/>
         <w:numPr>
           <w:ilvl w:val="0"/>
           <w:numId w:val="2"/>
         </w:numPr>
-        <w:spacing w:after="40"/>
-      </w:pPr>
-      <w:r>
-        <w:rPr>
-          <w:rFonts w:ascii="Arial" w:cs="Arial" w:eastAsia="Arial" w:hAnsi="Arial"/>
-          <w:sz w:val="21"/>
-          <w:szCs w:val="21"/>
+        <w:spacing w:after="70" w:line="270"/>
+      </w:pPr>
+      <w:r>
+        <w:rPr>
+          <w:rFonts w:ascii="Arial" w:cs="Arial" w:eastAsia="Arial" w:hAnsi="Arial"/>
+          <w:color w:val="1A1A1A"/>
+          <w:sz w:val="20"/>
+          <w:szCs w:val="20"/>
         </w:rPr>
         <w:t xml:space="preserve">Lead implementation, support, and training: 64 people and an $11.2M operating budget. Report to the COO.</w:t>
       </w:r>
@@ -540,13 +833,14 @@
           <w:ilvl w:val="0"/>
           <w:numId w:val="2"/>
         </w:numPr>
-        <w:spacing w:after="40"/>
-      </w:pPr>
-      <w:r>
-        <w:rPr>
-          <w:rFonts w:ascii="Arial" w:cs="Arial" w:eastAsia="Arial" w:hAnsi="Arial"/>
-          <w:sz w:val="21"/>
-          <w:szCs w:val="21"/>
+        <w:spacing w:after="70" w:line="270"/>
+      </w:pPr>
+      <w:r>
+        <w:rPr>
+          <w:rFonts w:ascii="Arial" w:cs="Arial" w:eastAsia="Arial" w:hAnsi="Arial"/>
+          <w:color w:val="1A1A1A"/>
+          <w:sz w:val="20"/>
+          <w:szCs w:val="20"/>
         </w:rPr>
         <w:t xml:space="preserve">Rebuilt onboarding around three standard tiers with fixed scopes and go-live checklists; average implementation time fell from 16 weeks to 9 weeks.</w:t>
       </w:r>
@@ -560,13 +854,14 @@
           <w:ilvl w:val="0"/>
           <w:numId w:val="2"/>
         </w:numPr>
-        <w:spacing w:after="40"/>
-      </w:pPr>
-      <w:r>
-        <w:rPr>
-          <w:rFonts w:ascii="Arial" w:cs="Arial" w:eastAsia="Arial" w:hAnsi="Arial"/>
-          <w:sz w:val="21"/>
-          <w:szCs w:val="21"/>
+        <w:spacing w:after="70" w:line="270"/>
+      </w:pPr>
+      <w:r>
+        <w:rPr>
+          <w:rFonts w:ascii="Arial" w:cs="Arial" w:eastAsia="Arial" w:hAnsi="Arial"/>
+          <w:color w:val="1A1A1A"/>
+          <w:sz w:val="20"/>
+          <w:szCs w:val="20"/>
         </w:rPr>
         <w:t xml:space="preserve">Paired each implementation lead with an account owner through the first renewal, which helped raise gross revenue retention from 89% to 95% in three years.</w:t>
       </w:r>
@@ -580,13 +875,14 @@
           <w:ilvl w:val="0"/>
           <w:numId w:val="2"/>
         </w:numPr>
-        <w:spacing w:after="40"/>
-      </w:pPr>
-      <w:r>
-        <w:rPr>
-          <w:rFonts w:ascii="Arial" w:cs="Arial" w:eastAsia="Arial" w:hAnsi="Arial"/>
-          <w:sz w:val="21"/>
-          <w:szCs w:val="21"/>
+        <w:spacing w:after="70" w:line="270"/>
+      </w:pPr>
+      <w:r>
+        <w:rPr>
+          <w:rFonts w:ascii="Arial" w:cs="Arial" w:eastAsia="Arial" w:hAnsi="Arial"/>
+          <w:color w:val="1A1A1A"/>
+          <w:sz w:val="20"/>
+          <w:szCs w:val="20"/>
         </w:rPr>
         <w:t xml:space="preserve">Ran the operations integration of Lanternfish Yard Systems (acquired 2023): 38 employees and 120 customers moved onto one support platform in 7 months, with 97% of acquired customers kept through year one.</w:t>
       </w:r>
@@ -600,13 +896,14 @@
           <w:ilvl w:val="0"/>
           <w:numId w:val="2"/>
         </w:numPr>
-        <w:spacing w:after="40"/>
-      </w:pPr>
-      <w:r>
-        <w:rPr>
-          <w:rFonts w:ascii="Arial" w:cs="Arial" w:eastAsia="Arial" w:hAnsi="Arial"/>
-          <w:sz w:val="21"/>
-          <w:szCs w:val="21"/>
+        <w:spacing w:after="70" w:line="270"/>
+      </w:pPr>
+      <w:r>
+        <w:rPr>
+          <w:rFonts w:ascii="Arial" w:cs="Arial" w:eastAsia="Arial" w:hAnsi="Arial"/>
+          <w:color w:val="1A1A1A"/>
+          <w:sz w:val="20"/>
+          <w:szCs w:val="20"/>
         </w:rPr>
         <w:t xml:space="preserve">Cut average ticket resolution time from 31 hours to 12 hours with tiered routing and a searchable fix library.</w:t>
       </w:r>
@@ -620,13 +917,14 @@
           <w:ilvl w:val="0"/>
           <w:numId w:val="2"/>
         </w:numPr>
-        <w:spacing w:after="40"/>
-      </w:pPr>
-      <w:r>
-        <w:rPr>
-          <w:rFonts w:ascii="Arial" w:cs="Arial" w:eastAsia="Arial" w:hAnsi="Arial"/>
-          <w:sz w:val="21"/>
-          <w:szCs w:val="21"/>
+        <w:spacing w:after="70" w:line="270"/>
+      </w:pPr>
+      <w:r>
+        <w:rPr>
+          <w:rFonts w:ascii="Arial" w:cs="Arial" w:eastAsia="Arial" w:hAnsi="Arial"/>
+          <w:color w:val="1A1A1A"/>
+          <w:sz w:val="20"/>
+          <w:szCs w:val="20"/>
         </w:rPr>
         <w:t xml:space="preserve">Reduced cost to serve per customer 22% from FY2022 to FY2024 while the customer base grew.</w:t>
       </w:r>
@@ -640,13 +938,14 @@
           <w:ilvl w:val="0"/>
           <w:numId w:val="2"/>
         </w:numPr>
-        <w:spacing w:after="40"/>
-      </w:pPr>
-      <w:r>
-        <w:rPr>
-          <w:rFonts w:ascii="Arial" w:cs="Arial" w:eastAsia="Arial" w:hAnsi="Arial"/>
-          <w:sz w:val="21"/>
-          <w:szCs w:val="21"/>
+        <w:spacing w:after="70" w:line="270"/>
+      </w:pPr>
+      <w:r>
+        <w:rPr>
+          <w:rFonts w:ascii="Arial" w:cs="Arial" w:eastAsia="Arial" w:hAnsi="Arial"/>
+          <w:color w:val="1A1A1A"/>
+          <w:sz w:val="20"/>
+          <w:szCs w:val="20"/>
         </w:rPr>
         <w:t xml:space="preserve">Launched a customer training academy that certified 1,100 customer users in 2024.</w:t>
       </w:r>
@@ -660,15 +959,64 @@
           <w:ilvl w:val="0"/>
           <w:numId w:val="2"/>
         </w:numPr>
-        <w:spacing w:after="40"/>
-      </w:pPr>
-      <w:r>
-        <w:rPr>
-          <w:rFonts w:ascii="Arial" w:cs="Arial" w:eastAsia="Arial" w:hAnsi="Arial"/>
-          <w:sz w:val="21"/>
-          <w:szCs w:val="21"/>
+        <w:spacing w:after="70" w:line="270"/>
+      </w:pPr>
+      <w:r>
+        <w:rPr>
+          <w:rFonts w:ascii="Arial" w:cs="Arial" w:eastAsia="Arial" w:hAnsi="Arial"/>
+          <w:color w:val="1A1A1A"/>
+          <w:sz w:val="20"/>
+          <w:szCs w:val="20"/>
         </w:rPr>
         <w:t xml:space="preserve">Consolidated support and training tools from 7 vendors to 3, saving $640K per year.</w:t>
+      </w:r>
+    </w:p>
+    <w:p>
+      <w:pPr>
+        <w:keepNext/>
+        <w:keepLines/>
+        <w:tabs>
+          <w:tab w:val="right" w:pos="10440"/>
+        </w:tabs>
+        <w:spacing w:after="0" w:before="140"/>
+      </w:pPr>
+      <w:r>
+        <w:rPr>
+          <w:rFonts w:ascii="Arial" w:cs="Arial" w:eastAsia="Arial" w:hAnsi="Arial"/>
+          <w:b/>
+          <w:bCs/>
+          <w:color w:val="1A2B4A"/>
+          <w:sz w:val="20"/>
+          <w:szCs w:val="20"/>
+        </w:rPr>
+        <w:t xml:space="preserve">Senior Manager, Customer Operations</w:t>
+      </w:r>
+      <w:r>
+        <w:rPr>
+          <w:rFonts w:ascii="Arial" w:cs="Arial" w:eastAsia="Arial" w:hAnsi="Arial"/>
+          <w:color w:val="666666"/>
+          <w:sz w:val="19"/>
+          <w:szCs w:val="19"/>
+        </w:rPr>
+        <w:t xml:space="preserve">	03/2019 to 12/2020</w:t>
+      </w:r>
+    </w:p>
+    <w:p>
+      <w:pPr>
+        <w:keepNext/>
+        <w:keepLines/>
+        <w:spacing w:after="30"/>
+      </w:pPr>
+      <w:r>
+        <w:rPr>
+          <w:rFonts w:ascii="Arial" w:cs="Arial" w:eastAsia="Arial" w:hAnsi="Arial"/>
+          <w:b/>
+          <w:bCs/>
+          <w:color w:val="1A1A1A"/>
+          <w:sz w:val="20"/>
+          <w:szCs w:val="20"/>
+        </w:rPr>
+        <w:t xml:space="preserve">Tidewater Freight Systems, Charlotte, NC</w:t>
       </w:r>
     </w:p>
     <w:p>
@@ -680,13 +1028,14 @@
           <w:ilvl w:val="0"/>
           <w:numId w:val="2"/>
         </w:numPr>
-        <w:spacing w:after="40"/>
-      </w:pPr>
-      <w:r>
-        <w:rPr>
-          <w:rFonts w:ascii="Arial" w:cs="Arial" w:eastAsia="Arial" w:hAnsi="Arial"/>
-          <w:sz w:val="21"/>
-          <w:szCs w:val="21"/>
+        <w:spacing w:after="70" w:line="270"/>
+      </w:pPr>
+      <w:r>
+        <w:rPr>
+          <w:rFonts w:ascii="Arial" w:cs="Arial" w:eastAsia="Arial" w:hAnsi="Arial"/>
+          <w:color w:val="1A1A1A"/>
+          <w:sz w:val="20"/>
+          <w:szCs w:val="20"/>
         </w:rPr>
         <w:t xml:space="preserve">Built the headcount capacity model finance now uses to plan post-sale hiring each quarter.</w:t>
       </w:r>
@@ -696,32 +1045,25 @@
         <w:keepNext/>
         <w:keepLines/>
         <w:tabs>
-          <w:tab w:val="right" w:pos="10800"/>
+          <w:tab w:val="right" w:pos="10440"/>
         </w:tabs>
-        <w:spacing w:after="0" w:before="100"/>
-      </w:pPr>
-      <w:r>
-        <w:rPr>
-          <w:rFonts w:ascii="Arial" w:cs="Arial" w:eastAsia="Arial" w:hAnsi="Arial"/>
-          <w:b/>
-          <w:bCs/>
-          <w:color w:val="1A2B4A"/>
-          <w:sz w:val="21"/>
-          <w:szCs w:val="21"/>
-        </w:rPr>
-        <w:t xml:space="preserve">Kestrel Route Software</w:t>
-      </w:r>
-      <w:r>
-        <w:rPr>
-          <w:rFonts w:ascii="Arial" w:cs="Arial" w:eastAsia="Arial" w:hAnsi="Arial"/>
-          <w:sz w:val="20"/>
-          <w:szCs w:val="20"/>
-        </w:rPr>
-        <w:t xml:space="preserve">, Atlanta, GA</w:t>
-      </w:r>
-      <w:r>
-        <w:rPr>
-          <w:rFonts w:ascii="Arial" w:cs="Arial" w:eastAsia="Arial" w:hAnsi="Arial"/>
+        <w:spacing w:after="0" w:before="140"/>
+      </w:pPr>
+      <w:r>
+        <w:rPr>
+          <w:rFonts w:ascii="Arial" w:cs="Arial" w:eastAsia="Arial" w:hAnsi="Arial"/>
+          <w:b/>
+          <w:bCs/>
+          <w:color w:val="1A2B4A"/>
+          <w:sz w:val="20"/>
+          <w:szCs w:val="20"/>
+        </w:rPr>
+        <w:t xml:space="preserve">Senior Manager, Implementation</w:t>
+      </w:r>
+      <w:r>
+        <w:rPr>
+          <w:rFonts w:ascii="Arial" w:cs="Arial" w:eastAsia="Arial" w:hAnsi="Arial"/>
+          <w:color w:val="666666"/>
           <w:sz w:val="19"/>
           <w:szCs w:val="19"/>
         </w:rPr>
@@ -732,37 +1074,34 @@
       <w:pPr>
         <w:keepNext/>
         <w:keepLines/>
-        <w:tabs>
-          <w:tab w:val="right" w:pos="10800"/>
-        </w:tabs>
-        <w:spacing w:after="0"/>
-      </w:pPr>
-      <w:r>
-        <w:rPr>
-          <w:rFonts w:ascii="Arial" w:cs="Arial" w:eastAsia="Arial" w:hAnsi="Arial"/>
-          <w:b/>
-          <w:bCs/>
+        <w:spacing w:after="30"/>
+      </w:pPr>
+      <w:r>
+        <w:rPr>
+          <w:rFonts w:ascii="Arial" w:cs="Arial" w:eastAsia="Arial" w:hAnsi="Arial"/>
+          <w:b/>
+          <w:bCs/>
+          <w:color w:val="1A1A1A"/>
+          <w:sz w:val="20"/>
+          <w:szCs w:val="20"/>
+        </w:rPr>
+        <w:t xml:space="preserve">Kestrel Route Software, Atlanta, GA</w:t>
+      </w:r>
+    </w:p>
+    <w:p>
+      <w:pPr>
+        <w:keepNext/>
+        <w:keepLines/>
+        <w:spacing w:after="40" w:line="250"/>
+      </w:pPr>
+      <w:r>
+        <w:rPr>
+          <w:rFonts w:ascii="Arial" w:cs="Arial" w:eastAsia="Arial" w:hAnsi="Arial"/>
           <w:i/>
           <w:iCs/>
-          <w:sz w:val="21"/>
-          <w:szCs w:val="21"/>
-        </w:rPr>
-        <w:t xml:space="preserve">Senior Manager, Implementation</w:t>
-      </w:r>
-    </w:p>
-    <w:p>
-      <w:pPr>
-        <w:keepNext/>
-        <w:spacing w:after="40"/>
-      </w:pPr>
-      <w:r>
-        <w:rPr>
-          <w:rFonts w:ascii="Arial" w:cs="Arial" w:eastAsia="Arial" w:hAnsi="Arial"/>
-          <w:i/>
-          <w:iCs/>
-          <w:color w:val="444444"/>
-          <w:sz w:val="18"/>
-          <w:szCs w:val="18"/>
+          <w:color w:val="666666"/>
+          <w:sz w:val="19"/>
+          <w:szCs w:val="19"/>
         </w:rPr>
         <w:t xml:space="preserve">Route planning software for regional distributors.</w:t>
       </w:r>
@@ -770,19 +1109,20 @@
     <w:p>
       <w:pPr>
         <w:pStyle w:val="ListParagraph"/>
-        <w:keepNext/>
+        <w:keepNext w:val="false"/>
         <w:keepLines/>
         <w:numPr>
           <w:ilvl w:val="0"/>
           <w:numId w:val="2"/>
         </w:numPr>
-        <w:spacing w:after="40"/>
-      </w:pPr>
-      <w:r>
-        <w:rPr>
-          <w:rFonts w:ascii="Arial" w:cs="Arial" w:eastAsia="Arial" w:hAnsi="Arial"/>
-          <w:sz w:val="21"/>
-          <w:szCs w:val="21"/>
+        <w:spacing w:after="70" w:line="270"/>
+      </w:pPr>
+      <w:r>
+        <w:rPr>
+          <w:rFonts w:ascii="Arial" w:cs="Arial" w:eastAsia="Arial" w:hAnsi="Arial"/>
+          <w:color w:val="1A1A1A"/>
+          <w:sz w:val="20"/>
+          <w:szCs w:val="20"/>
         </w:rPr>
         <w:t xml:space="preserve">Built the implementation team from 6 to 23 people and onboarded 140 new customers in 2017 and 2018.</w:t>
       </w:r>
@@ -796,13 +1136,14 @@
           <w:ilvl w:val="0"/>
           <w:numId w:val="2"/>
         </w:numPr>
-        <w:spacing w:after="40"/>
-      </w:pPr>
-      <w:r>
-        <w:rPr>
-          <w:rFonts w:ascii="Arial" w:cs="Arial" w:eastAsia="Arial" w:hAnsi="Arial"/>
-          <w:sz w:val="21"/>
-          <w:szCs w:val="21"/>
+        <w:spacing w:after="70" w:line="270"/>
+      </w:pPr>
+      <w:r>
+        <w:rPr>
+          <w:rFonts w:ascii="Arial" w:cs="Arial" w:eastAsia="Arial" w:hAnsi="Arial"/>
+          <w:color w:val="1A1A1A"/>
+          <w:sz w:val="20"/>
+          <w:szCs w:val="20"/>
         </w:rPr>
         <w:t xml:space="preserve">Wrote the standard implementation playbook that cut go-live defects 45%.</w:t>
       </w:r>
@@ -816,13 +1157,14 @@
           <w:ilvl w:val="0"/>
           <w:numId w:val="2"/>
         </w:numPr>
-        <w:spacing w:after="40"/>
-      </w:pPr>
-      <w:r>
-        <w:rPr>
-          <w:rFonts w:ascii="Arial" w:cs="Arial" w:eastAsia="Arial" w:hAnsi="Arial"/>
-          <w:sz w:val="21"/>
-          <w:szCs w:val="21"/>
+        <w:spacing w:after="70" w:line="270"/>
+      </w:pPr>
+      <w:r>
+        <w:rPr>
+          <w:rFonts w:ascii="Arial" w:cs="Arial" w:eastAsia="Arial" w:hAnsi="Arial"/>
+          <w:color w:val="1A1A1A"/>
+          <w:sz w:val="20"/>
+          <w:szCs w:val="20"/>
         </w:rPr>
         <w:t xml:space="preserve">Set up the first customer health score, used by sales and support to plan renewals.</w:t>
       </w:r>
@@ -836,13 +1178,14 @@
           <w:ilvl w:val="0"/>
           <w:numId w:val="2"/>
         </w:numPr>
-        <w:spacing w:after="40"/>
-      </w:pPr>
-      <w:r>
-        <w:rPr>
-          <w:rFonts w:ascii="Arial" w:cs="Arial" w:eastAsia="Arial" w:hAnsi="Arial"/>
-          <w:sz w:val="21"/>
-          <w:szCs w:val="21"/>
+        <w:spacing w:after="70" w:line="270"/>
+      </w:pPr>
+      <w:r>
+        <w:rPr>
+          <w:rFonts w:ascii="Arial" w:cs="Arial" w:eastAsia="Arial" w:hAnsi="Arial"/>
+          <w:color w:val="1A1A1A"/>
+          <w:sz w:val="20"/>
+          <w:szCs w:val="20"/>
         </w:rPr>
         <w:t xml:space="preserve">Hired and trained the first two implementation managers promoted from within.</w:t>
       </w:r>
@@ -852,115 +1195,63 @@
         <w:keepNext/>
         <w:keepLines/>
         <w:tabs>
-          <w:tab w:val="right" w:pos="10800"/>
+          <w:tab w:val="right" w:pos="10440"/>
         </w:tabs>
-        <w:spacing w:after="0" w:before="100"/>
-      </w:pPr>
-      <w:r>
-        <w:rPr>
-          <w:rFonts w:ascii="Arial" w:cs="Arial" w:eastAsia="Arial" w:hAnsi="Arial"/>
-          <w:b/>
-          <w:bCs/>
-          <w:color w:val="1A2B4A"/>
-          <w:sz w:val="21"/>
-          <w:szCs w:val="21"/>
-        </w:rPr>
-        <w:t xml:space="preserve">Brightpine Distribution</w:t>
-      </w:r>
-      <w:r>
-        <w:rPr>
-          <w:rFonts w:ascii="Arial" w:cs="Arial" w:eastAsia="Arial" w:hAnsi="Arial"/>
-          <w:sz w:val="20"/>
-          <w:szCs w:val="20"/>
-        </w:rPr>
-        <w:t xml:space="preserve">, Charlotte, NC</w:t>
-      </w:r>
-      <w:r>
-        <w:rPr>
-          <w:rFonts w:ascii="Arial" w:cs="Arial" w:eastAsia="Arial" w:hAnsi="Arial"/>
-          <w:sz w:val="19"/>
-          <w:szCs w:val="19"/>
-        </w:rPr>
-        <w:t xml:space="preserve">	07/2012 to 05/2015</w:t>
+        <w:spacing w:after="0" w:before="140"/>
+      </w:pPr>
+      <w:r>
+        <w:rPr>
+          <w:rFonts w:ascii="Arial" w:cs="Arial" w:eastAsia="Arial" w:hAnsi="Arial"/>
+          <w:b/>
+          <w:bCs/>
+          <w:color w:val="1A2B4A"/>
+          <w:sz w:val="20"/>
+          <w:szCs w:val="20"/>
+        </w:rPr>
+        <w:t xml:space="preserve">Operations Manager</w:t>
+      </w:r>
+      <w:r>
+        <w:rPr>
+          <w:rFonts w:ascii="Arial" w:cs="Arial" w:eastAsia="Arial" w:hAnsi="Arial"/>
+          <w:color w:val="666666"/>
+          <w:sz w:val="19"/>
+          <w:szCs w:val="19"/>
+        </w:rPr>
+        <w:t xml:space="preserve">	09/2013 to 05/2015</w:t>
       </w:r>
     </w:p>
     <w:p>
       <w:pPr>
         <w:keepNext/>
         <w:keepLines/>
-        <w:tabs>
-          <w:tab w:val="right" w:pos="10800"/>
-        </w:tabs>
-        <w:spacing w:after="0"/>
-      </w:pPr>
-      <w:r>
-        <w:rPr>
-          <w:rFonts w:ascii="Arial" w:cs="Arial" w:eastAsia="Arial" w:hAnsi="Arial"/>
-          <w:b/>
-          <w:bCs/>
+        <w:spacing w:after="30"/>
+      </w:pPr>
+      <w:r>
+        <w:rPr>
+          <w:rFonts w:ascii="Arial" w:cs="Arial" w:eastAsia="Arial" w:hAnsi="Arial"/>
+          <w:b/>
+          <w:bCs/>
+          <w:color w:val="1A1A1A"/>
+          <w:sz w:val="20"/>
+          <w:szCs w:val="20"/>
+        </w:rPr>
+        <w:t xml:space="preserve">Brightpine Distribution, Charlotte, NC</w:t>
+      </w:r>
+    </w:p>
+    <w:p>
+      <w:pPr>
+        <w:keepNext/>
+        <w:keepLines/>
+        <w:spacing w:after="40" w:line="250"/>
+      </w:pPr>
+      <w:r>
+        <w:rPr>
+          <w:rFonts w:ascii="Arial" w:cs="Arial" w:eastAsia="Arial" w:hAnsi="Arial"/>
           <w:i/>
           <w:iCs/>
-          <w:sz w:val="21"/>
-          <w:szCs w:val="21"/>
-        </w:rPr>
-        <w:t xml:space="preserve">Operations Manager</w:t>
-      </w:r>
-      <w:r>
-        <w:rPr>
-          <w:rFonts w:ascii="Arial" w:cs="Arial" w:eastAsia="Arial" w:hAnsi="Arial"/>
-          <w:i/>
-          <w:iCs/>
-          <w:sz w:val="18"/>
-          <w:szCs w:val="18"/>
-        </w:rPr>
-        <w:t xml:space="preserve">	09/2013 to 05/2015</w:t>
-      </w:r>
-    </w:p>
-    <w:p>
-      <w:pPr>
-        <w:keepNext/>
-        <w:keepLines/>
-        <w:tabs>
-          <w:tab w:val="right" w:pos="10800"/>
-        </w:tabs>
-        <w:spacing w:after="0"/>
-      </w:pPr>
-      <w:r>
-        <w:rPr>
-          <w:rFonts w:ascii="Arial" w:cs="Arial" w:eastAsia="Arial" w:hAnsi="Arial"/>
-          <w:b/>
-          <w:bCs/>
-          <w:i/>
-          <w:iCs/>
-          <w:sz w:val="21"/>
-          <w:szCs w:val="21"/>
-        </w:rPr>
-        <w:t xml:space="preserve">Logistics Analyst</w:t>
-      </w:r>
-      <w:r>
-        <w:rPr>
-          <w:rFonts w:ascii="Arial" w:cs="Arial" w:eastAsia="Arial" w:hAnsi="Arial"/>
-          <w:i/>
-          <w:iCs/>
-          <w:sz w:val="18"/>
-          <w:szCs w:val="18"/>
-        </w:rPr>
-        <w:t xml:space="preserve">	07/2012 to 08/2013</w:t>
-      </w:r>
-    </w:p>
-    <w:p>
-      <w:pPr>
-        <w:keepNext/>
-        <w:spacing w:after="40"/>
-      </w:pPr>
-      <w:r>
-        <w:rPr>
-          <w:rFonts w:ascii="Arial" w:cs="Arial" w:eastAsia="Arial" w:hAnsi="Arial"/>
-          <w:i/>
-          <w:iCs/>
-          <w:color w:val="444444"/>
-          <w:sz w:val="18"/>
-          <w:szCs w:val="18"/>
+          <w:color w:val="666666"/>
+          <w:sz w:val="19"/>
+          <w:szCs w:val="19"/>
         </w:rPr>
         <w:t xml:space="preserve">Third-party logistics provider with two distribution centers.</w:t>
       </w:r>
@@ -968,19 +1259,20 @@
     <w:p>
       <w:pPr>
         <w:pStyle w:val="ListParagraph"/>
-        <w:keepNext/>
+        <w:keepNext w:val="false"/>
         <w:keepLines/>
         <w:numPr>
           <w:ilvl w:val="0"/>
           <w:numId w:val="2"/>
         </w:numPr>
-        <w:spacing w:after="40"/>
-      </w:pPr>
-      <w:r>
-        <w:rPr>
-          <w:rFonts w:ascii="Arial" w:cs="Arial" w:eastAsia="Arial" w:hAnsi="Arial"/>
-          <w:sz w:val="21"/>
-          <w:szCs w:val="21"/>
+        <w:spacing w:after="70" w:line="270"/>
+      </w:pPr>
+      <w:r>
+        <w:rPr>
+          <w:rFonts w:ascii="Arial" w:cs="Arial" w:eastAsia="Arial" w:hAnsi="Arial"/>
+          <w:color w:val="1A1A1A"/>
+          <w:sz w:val="20"/>
+          <w:szCs w:val="20"/>
         </w:rPr>
         <w:t xml:space="preserve">Ran daily operations for two distribution centers and 85 hourly associates.</w:t>
       </w:r>
@@ -994,13 +1286,14 @@
           <w:ilvl w:val="0"/>
           <w:numId w:val="2"/>
         </w:numPr>
-        <w:spacing w:after="40"/>
-      </w:pPr>
-      <w:r>
-        <w:rPr>
-          <w:rFonts w:ascii="Arial" w:cs="Arial" w:eastAsia="Arial" w:hAnsi="Arial"/>
-          <w:sz w:val="21"/>
-          <w:szCs w:val="21"/>
+        <w:spacing w:after="70" w:line="270"/>
+      </w:pPr>
+      <w:r>
+        <w:rPr>
+          <w:rFonts w:ascii="Arial" w:cs="Arial" w:eastAsia="Arial" w:hAnsi="Arial"/>
+          <w:color w:val="1A1A1A"/>
+          <w:sz w:val="20"/>
+          <w:szCs w:val="20"/>
         </w:rPr>
         <w:t xml:space="preserve">Raised on-time shipment rate from 91% to 98.5% across both distribution centers.</w:t>
       </w:r>
@@ -1014,15 +1307,64 @@
           <w:ilvl w:val="0"/>
           <w:numId w:val="2"/>
         </w:numPr>
-        <w:spacing w:after="40"/>
-      </w:pPr>
-      <w:r>
-        <w:rPr>
-          <w:rFonts w:ascii="Arial" w:cs="Arial" w:eastAsia="Arial" w:hAnsi="Arial"/>
-          <w:sz w:val="21"/>
-          <w:szCs w:val="21"/>
+        <w:spacing w:after="70" w:line="270"/>
+      </w:pPr>
+      <w:r>
+        <w:rPr>
+          <w:rFonts w:ascii="Arial" w:cs="Arial" w:eastAsia="Arial" w:hAnsi="Arial"/>
+          <w:color w:val="1A1A1A"/>
+          <w:sz w:val="20"/>
+          <w:szCs w:val="20"/>
         </w:rPr>
         <w:t xml:space="preserve">Cut overtime cost by $410K per year with demand-based shift planning.</w:t>
+      </w:r>
+    </w:p>
+    <w:p>
+      <w:pPr>
+        <w:keepNext/>
+        <w:keepLines/>
+        <w:tabs>
+          <w:tab w:val="right" w:pos="10440"/>
+        </w:tabs>
+        <w:spacing w:after="0" w:before="140"/>
+      </w:pPr>
+      <w:r>
+        <w:rPr>
+          <w:rFonts w:ascii="Arial" w:cs="Arial" w:eastAsia="Arial" w:hAnsi="Arial"/>
+          <w:b/>
+          <w:bCs/>
+          <w:color w:val="1A2B4A"/>
+          <w:sz w:val="20"/>
+          <w:szCs w:val="20"/>
+        </w:rPr>
+        <w:t xml:space="preserve">Logistics Analyst</w:t>
+      </w:r>
+      <w:r>
+        <w:rPr>
+          <w:rFonts w:ascii="Arial" w:cs="Arial" w:eastAsia="Arial" w:hAnsi="Arial"/>
+          <w:color w:val="666666"/>
+          <w:sz w:val="19"/>
+          <w:szCs w:val="19"/>
+        </w:rPr>
+        <w:t xml:space="preserve">	07/2012 to 08/2013</w:t>
+      </w:r>
+    </w:p>
+    <w:p>
+      <w:pPr>
+        <w:keepNext/>
+        <w:keepLines/>
+        <w:spacing w:after="30"/>
+      </w:pPr>
+      <w:r>
+        <w:rPr>
+          <w:rFonts w:ascii="Arial" w:cs="Arial" w:eastAsia="Arial" w:hAnsi="Arial"/>
+          <w:b/>
+          <w:bCs/>
+          <w:color w:val="1A1A1A"/>
+          <w:sz w:val="20"/>
+          <w:szCs w:val="20"/>
+        </w:rPr>
+        <w:t xml:space="preserve">Brightpine Distribution, Charlotte, NC</w:t>
       </w:r>
     </w:p>
     <w:p>
@@ -1034,49 +1376,50 @@
           <w:ilvl w:val="0"/>
           <w:numId w:val="2"/>
         </w:numPr>
-        <w:spacing w:after="40"/>
-      </w:pPr>
-      <w:r>
-        <w:rPr>
-          <w:rFonts w:ascii="Arial" w:cs="Arial" w:eastAsia="Arial" w:hAnsi="Arial"/>
+        <w:spacing w:after="70" w:line="270"/>
+      </w:pPr>
+      <w:r>
+        <w:rPr>
+          <w:rFonts w:ascii="Arial" w:cs="Arial" w:eastAsia="Arial" w:hAnsi="Arial"/>
+          <w:color w:val="1A1A1A"/>
+          <w:sz w:val="20"/>
+          <w:szCs w:val="20"/>
+        </w:rPr>
+        <w:t xml:space="preserve">Built the weekly carrier scorecard used in rate negotiations.</w:t>
+      </w:r>
+    </w:p>
+    <w:p>
+      <w:pPr>
+        <w:keepNext/>
+        <w:keepLines/>
+        <w:pBdr>
+          <w:bottom w:val="single" w:color="1A2B4A" w:sz="4" w:space="3"/>
+        </w:pBdr>
+        <w:spacing w:after="80" w:before="220"/>
+      </w:pPr>
+      <w:r>
+        <w:rPr>
+          <w:rFonts w:ascii="Arial" w:cs="Arial" w:eastAsia="Arial" w:hAnsi="Arial"/>
+          <w:b/>
+          <w:bCs/>
+          <w:color w:val="1A2B4A"/>
           <w:sz w:val="21"/>
           <w:szCs w:val="21"/>
         </w:rPr>
-        <w:t xml:space="preserve">As a logistics analyst, built the weekly carrier scorecard used in rate negotiations.</w:t>
-      </w:r>
-    </w:p>
-    <w:p>
-      <w:pPr>
-        <w:keepNext/>
-        <w:keepLines/>
-        <w:pBdr>
-          <w:bottom w:val="single" w:color="1A2B4A" w:sz="8" w:space="2"/>
-        </w:pBdr>
-        <w:spacing w:after="60" w:before="160"/>
-      </w:pPr>
-      <w:r>
-        <w:rPr>
-          <w:rFonts w:ascii="Arial" w:cs="Arial" w:eastAsia="Arial" w:hAnsi="Arial"/>
-          <w:b/>
-          <w:bCs/>
-          <w:color w:val="1A2B4A"/>
-          <w:spacing w:val="20"/>
-          <w:sz w:val="21"/>
-          <w:szCs w:val="21"/>
-        </w:rPr>
         <w:t xml:space="preserve">EDUCATION AND CERTIFICATIONS</w:t>
       </w:r>
     </w:p>
     <w:p>
       <w:pPr>
         <w:keepLines/>
-        <w:spacing w:after="20"/>
-      </w:pPr>
-      <w:r>
-        <w:rPr>
-          <w:rFonts w:ascii="Arial" w:cs="Arial" w:eastAsia="Arial" w:hAnsi="Arial"/>
-          <w:sz w:val="21"/>
-          <w:szCs w:val="21"/>
+        <w:spacing w:after="0" w:line="280"/>
+      </w:pPr>
+      <w:r>
+        <w:rPr>
+          <w:rFonts w:ascii="Arial" w:cs="Arial" w:eastAsia="Arial" w:hAnsi="Arial"/>
+          <w:color w:val="1A1A1A"/>
+          <w:sz w:val="20"/>
+          <w:szCs w:val="20"/>
         </w:rPr>
         <w:t xml:space="preserve">B.S. Industrial Engineering, Carolina Lakes University (fictional), 2012</w:t>
       </w:r>
@@ -1084,13 +1427,14 @@
     <w:p>
       <w:pPr>
         <w:keepLines/>
-        <w:spacing w:after="20"/>
-      </w:pPr>
-      <w:r>
-        <w:rPr>
-          <w:rFonts w:ascii="Arial" w:cs="Arial" w:eastAsia="Arial" w:hAnsi="Arial"/>
-          <w:sz w:val="21"/>
-          <w:szCs w:val="21"/>
+        <w:spacing w:after="0" w:line="280"/>
+      </w:pPr>
+      <w:r>
+        <w:rPr>
+          <w:rFonts w:ascii="Arial" w:cs="Arial" w:eastAsia="Arial" w:hAnsi="Arial"/>
+          <w:color w:val="1A1A1A"/>
+          <w:sz w:val="20"/>
+          <w:szCs w:val="20"/>
         </w:rPr>
         <w:t xml:space="preserve">Certified Supply Chain Professional (CSCP), 2016</w:t>
       </w:r>
@@ -1098,20 +1442,21 @@
     <w:p>
       <w:pPr>
         <w:keepLines/>
-        <w:spacing w:after="20"/>
-      </w:pPr>
-      <w:r>
-        <w:rPr>
-          <w:rFonts w:ascii="Arial" w:cs="Arial" w:eastAsia="Arial" w:hAnsi="Arial"/>
-          <w:sz w:val="21"/>
-          <w:szCs w:val="21"/>
+        <w:spacing w:after="0" w:line="280"/>
+      </w:pPr>
+      <w:r>
+        <w:rPr>
+          <w:rFonts w:ascii="Arial" w:cs="Arial" w:eastAsia="Arial" w:hAnsi="Arial"/>
+          <w:color w:val="1A1A1A"/>
+          <w:sz w:val="20"/>
+          <w:szCs w:val="20"/>
         </w:rPr>
         <w:t xml:space="preserve">Lean Six Sigma Green Belt, 2014</w:t>
       </w:r>
     </w:p>
     <w:sectPr>
       <w:pgSz w:w="12240" w:h="15840" w:orient="portrait"/>
-      <w:pgMar w:top="720" w:right="720" w:bottom="720" w:left="720" w:header="708" w:footer="708" w:gutter="0"/>
+      <w:pgMar w:top="720" w:right="900" w:bottom="720" w:left="900" w:header="708" w:footer="708" w:gutter="0"/>
       <w:pgNumType/>
       <w:docGrid w:linePitch="360"/>
     </w:sectPr>
@@ -1289,6 +1634,10 @@
       <w:pPr>
         <w:ind w:left="300" w:hanging="220"/>
       </w:pPr>
+      <w:rPr>
+        <w:rFonts w:ascii="Arial" w:cs="Arial" w:eastAsia="Arial" w:hAnsi="Arial"/>
+        <w:color w:val="000000"/>
+      </w:rPr>
     </w:lvl>
   </w:abstractNum>
   <w:num w:numId="1">
@@ -1312,8 +1661,9 @@
     <w:rPrDefault>
       <w:rPr>
         <w:rFonts w:ascii="Arial" w:cs="Arial" w:eastAsia="Arial" w:hAnsi="Arial"/>
-        <w:sz w:val="21"/>
-        <w:szCs w:val="21"/>
+        <w:color w:val="1A1A1A"/>
+        <w:sz w:val="20"/>
+        <w:szCs w:val="20"/>
       </w:rPr>
     </w:rPrDefault>
     <w:pPrDefault/>

</xml_diff>